<commit_message>
Update SCRIPT and HTML with professional tone, and replace placeholders using PDFs
</commit_message>
<xml_diff>
--- a/SCRIPT_WORKSHOP_AI_S1.docx
+++ b/SCRIPT_WORKSHOP_AI_S1.docx
@@ -11,86 +11,55 @@
           <w:color w:val="06006B"/>
           <w:sz w:val="40"/>
         </w:rPr>
-        <w:t>SCRIPT — Workshop AI: Sessione 1</w:t>
+        <w:t>🎙️ SCRIPT — Workshop AI: Sessione 1</w:t>
       </w:r>
     </w:p>
     <w:p>
+      <w:pPr>
+        <w:ind w:left="432"/>
+      </w:pPr>
       <w:r>
         <w:rPr>
-          <w:b/>
-          <w:i w:val="0"/>
-          <w:color w:val="000000"/>
-          <w:sz w:val="26"/>
+          <w:color w:val="0055AA"/>
+          <w:sz w:val="20"/>
         </w:rPr>
-        <w:t>"Manuale di sopravvivenza all'AI"</w:t>
+        <w:t>**"Manuale di sopravvivenza all'AI"**</w:t>
       </w:r>
     </w:p>
     <w:p>
+      <w:pPr>
+        <w:ind w:left="432"/>
+      </w:pPr>
       <w:r>
         <w:rPr>
-          <w:b w:val="0"/>
-          <w:i w:val="0"/>
-          <w:color w:val="555555"/>
-          <w:sz w:val="22"/>
+          <w:color w:val="0055AA"/>
+          <w:sz w:val="20"/>
         </w:rPr>
-        <w:t>Durata: ~50 min  |  Oratori: Sara · Alberto · Gaia · Caterina</w:t>
+        <w:t>Durata: ~50 min | 4 oratori: Sara · Alberto · Gaia · Caterina</w:t>
       </w:r>
     </w:p>
     <w:p>
-      <w:r>
-        <w:rPr>
-          <w:b w:val="0"/>
-          <w:i w:val="0"/>
-          <w:color w:val="555555"/>
-          <w:sz w:val="22"/>
-        </w:rPr>
-        <w:t>Formato: 30' teoria dialogica + 10' mani in pasta + 10' confronto aperto  |  24 slide</w:t>
-      </w:r>
-    </w:p>
-    <w:p/>
-    <w:p>
       <w:pPr>
-        <w:pStyle w:val="Heading3"/>
+        <w:ind w:left="432"/>
       </w:pPr>
       <w:r>
         <w:rPr>
-          <w:color w:val="F00A0A"/>
-          <w:sz w:val="24"/>
+          <w:color w:val="0055AA"/>
+          <w:sz w:val="20"/>
         </w:rPr>
-        <w:t>LEGENDA</w:t>
+        <w:t>Formato: 30' teoria dialogica + 10' mani in pasta + 10' confronto aperto</w:t>
       </w:r>
     </w:p>
     <w:p>
+      <w:pPr>
+        <w:ind w:left="432"/>
+      </w:pPr>
       <w:r>
         <w:rPr>
-          <w:b w:val="0"/>
-          <w:i w:val="0"/>
-          <w:color w:val="555555"/>
+          <w:color w:val="0055AA"/>
           <w:sz w:val="20"/>
         </w:rPr>
-        <w:t>[slide →] = cambio slide     [schermo] = cosa appare sullo schermo</w:t>
-      </w:r>
-    </w:p>
-    <w:p>
-      <w:r>
-        <w:rPr>
-          <w:b w:val="0"/>
-          <w:i/>
-          <w:color w:val="555555"/>
-          <w:sz w:val="20"/>
-        </w:rPr>
-        <w:t>(nota corsiva) = indicazioni di regia / movimento</w:t>
-      </w:r>
-    </w:p>
-    <w:p>
-      <w:r>
-        <w:rPr>
-          <w:b w:val="0"/>
-          <w:i w:val="0"/>
-          <w:color w:val="FF9900"/>
-          <w:sz w:val="20"/>
-        </w:rPr>
-        <w:t>[PLACEHOLDER] = contenuto da completare con i PDF</w:t>
+        <w:t>Totale: 24 slide</w:t>
       </w:r>
     </w:p>
     <w:p/>
@@ -103,6 +72,7 @@
         <w:t>──────────────────────────────────────────────────────────────────────</w:t>
       </w:r>
     </w:p>
+    <w:p/>
     <w:p>
       <w:pPr>
         <w:pStyle w:val="Heading2"/>
@@ -112,9 +82,40 @@
           <w:color w:val="06006B"/>
           <w:sz w:val="30"/>
         </w:rPr>
-        <w:t>PARTE 1 — TEORIA DIALOGICA (30 min)</w:t>
+        <w:t>LEGENDA</w:t>
       </w:r>
     </w:p>
+    <w:p>
+      <w:r>
+        <w:t>- **[slide →]** cambio slide</w:t>
+      </w:r>
+    </w:p>
+    <w:p>
+      <w:r>
+        <w:t>- **[schermo]** cosa appare a schermo</w:t>
+      </w:r>
+    </w:p>
+    <w:p>
+      <w:r>
+        <w:t>- *(regia)* indicazione gestuale/di movimento</w:t>
+      </w:r>
+    </w:p>
+    <w:p>
+      <w:r>
+        <w:t>- `[PLACEHOLDER]` contenuto da completare con i PDF</w:t>
+      </w:r>
+    </w:p>
+    <w:p/>
+    <w:p>
+      <w:r>
+        <w:rPr>
+          <w:color w:val="555555"/>
+          <w:sz w:val="16"/>
+        </w:rPr>
+        <w:t>──────────────────────────────────────────────────────────────────────</w:t>
+      </w:r>
+    </w:p>
+    <w:p/>
     <w:p>
       <w:r>
         <w:rPr>
@@ -127,12 +128,35 @@
     <w:p/>
     <w:p>
       <w:pPr>
-        <w:pStyle w:val="Heading3"/>
+        <w:pStyle w:val="Heading1"/>
       </w:pPr>
       <w:r>
         <w:rPr>
-          <w:color w:val="F00A0A"/>
-          <w:sz w:val="24"/>
+          <w:color w:val="06006B"/>
+          <w:sz w:val="40"/>
+        </w:rPr>
+        <w:t>🧠 PARTE 1 — TEORIA DIALOGICA (30 min)</w:t>
+      </w:r>
+    </w:p>
+    <w:p/>
+    <w:p>
+      <w:r>
+        <w:rPr>
+          <w:color w:val="555555"/>
+          <w:sz w:val="16"/>
+        </w:rPr>
+        <w:t>──────────────────────────────────────────────────────────────────────</w:t>
+      </w:r>
+    </w:p>
+    <w:p/>
+    <w:p>
+      <w:pPr>
+        <w:pStyle w:val="Heading2"/>
+      </w:pPr>
+      <w:r>
+        <w:rPr>
+          <w:color w:val="06006B"/>
+          <w:sz w:val="30"/>
         </w:rPr>
         <w:t>SLIDE 1 — COVER</w:t>
       </w:r>
@@ -146,83 +170,63 @@
           <w:color w:val="0055AA"/>
           <w:sz w:val="20"/>
         </w:rPr>
-        <w:t>[schermo] "Manuale di sopravvivenza all'AI" | "Ecosistema · Prompt Engineering · Sfide Etiche" | Workshop AI Interno — Sessione 1</w:t>
+        <w:t>[schermo] "Manuale di sopravvivenza all'AI" | "Ecosistema · Prompt Engineering · Sfide Etiche" | "Workshop AI Interno — Sessione 1"</w:t>
+      </w:r>
+    </w:p>
+    <w:p/>
+    <w:p>
+      <w:r>
+        <w:t>**CATERINA:** Benvenuti. Siamo Sara, Alberto, Gaia e Caterina. Oggi vi parliamo di AI per condividere quanto abbiamo appreso usandola quotidianamente nei nostri processi. Non siamo qui per fare una lezione cattedratica, ma per esplorare insieme come questi strumenti stiano cambiando il nostro modo di lavorare.</w:t>
+      </w:r>
+    </w:p>
+    <w:p/>
+    <w:p>
+      <w:r>
+        <w:t>**SARA:** L'obiettivo è proprio quello di fare chiarezza e darvi la sicurezza necessaria per sperimentare.</w:t>
+      </w:r>
+    </w:p>
+    <w:p/>
+    <w:p>
+      <w:r>
+        <w:t>**ALBERTO:** Abbiamo pensato a questa sessione come a un momento di condivisione pratica tra colleghi. Un confronto aperto sui pro, i contro e le sfide di questa tecnologia.</w:t>
+      </w:r>
+    </w:p>
+    <w:p/>
+    <w:p>
+      <w:r>
+        <w:t>**GAIA:** Parleremo anche di un aspetto spesso sottovalutato, ma per noi molto importante: l'impatto etico e ambientale dell'AI.</w:t>
       </w:r>
     </w:p>
     <w:p/>
     <w:p>
       <w:r>
         <w:rPr>
-          <w:b/>
-          <w:color w:val="880088"/>
-          <w:sz w:val="22"/>
+          <w:i/>
+          <w:color w:val="555555"/>
+          <w:sz w:val="20"/>
         </w:rPr>
-        <w:t xml:space="preserve">CATERINA: </w:t>
-      </w:r>
-      <w:r>
-        <w:rPr>
-          <w:sz w:val="22"/>
-        </w:rPr>
-        <w:t>Benvenuti. Siamo Sara, Alberto, Gaia e Caterina. Oggi vi parliamo di AI per condividere quanto abbiamo appreso usandola quotidianamente nei nostri processi. Non siamo qui per fare una lezione cattedratica, ma per esplorare insieme come questi strumenti stiano cambiando il nostro modo di lavorare.</w:t>
+        <w:t>**[slide →]**</w:t>
       </w:r>
     </w:p>
+    <w:p/>
     <w:p>
       <w:r>
         <w:rPr>
-          <w:b/>
-          <w:color w:val="06006B"/>
-          <w:sz w:val="22"/>
+          <w:color w:val="555555"/>
+          <w:sz w:val="16"/>
         </w:rPr>
-        <w:t xml:space="preserve">SARA: </w:t>
-      </w:r>
-      <w:r>
-        <w:rPr>
-          <w:sz w:val="22"/>
-        </w:rPr>
-        <w:t>L'obiettivo è proprio quello di fare chiarezza e darvi la sicurezza necessaria per sperimentare.</w:t>
-      </w:r>
-    </w:p>
-    <w:p>
-      <w:r>
-        <w:rPr>
-          <w:b/>
-          <w:color w:val="F00A0A"/>
-          <w:sz w:val="22"/>
-        </w:rPr>
-        <w:t xml:space="preserve">ALBERTO: </w:t>
-      </w:r>
-      <w:r>
-        <w:rPr>
-          <w:sz w:val="22"/>
-        </w:rPr>
-        <w:t>Abbiamo pensato a questa sessione come a un momento di condivisione pratica tra colleghi. Un confronto aperto sui pro, i contro e le sfide di questa tecnologia.</w:t>
-      </w:r>
-    </w:p>
-    <w:p>
-      <w:r>
-        <w:rPr>
-          <w:b/>
-          <w:color w:val="008844"/>
-          <w:sz w:val="22"/>
-        </w:rPr>
-        <w:t xml:space="preserve">GAIA: </w:t>
-      </w:r>
-      <w:r>
-        <w:rPr>
-          <w:sz w:val="22"/>
-        </w:rPr>
-        <w:t>Parleremo anche di un aspetto spesso sottovalutato, ma per noi molto importante: l'impatto etico e ambientale dell'AI.</w:t>
+        <w:t>──────────────────────────────────────────────────────────────────────</w:t>
       </w:r>
     </w:p>
     <w:p/>
     <w:p>
       <w:pPr>
-        <w:pStyle w:val="Heading3"/>
+        <w:pStyle w:val="Heading2"/>
       </w:pPr>
       <w:r>
         <w:rPr>
-          <w:color w:val="F00A0A"/>
-          <w:sz w:val="24"/>
+          <w:color w:val="06006B"/>
+          <w:sz w:val="30"/>
         </w:rPr>
         <w:t>SLIDE 2 — SCALETTA</w:t>
       </w:r>
@@ -239,48 +243,60 @@
         <w:t>[schermo] 4 punti: 01 Ecosistema AI &amp; Consumi | 02 Gestione dei File | 03 Prompt Optimization | 04 Generazioni Inclusive &amp; Etica</w:t>
       </w:r>
     </w:p>
+    <w:p>
+      <w:pPr>
+        <w:ind w:left="432"/>
+      </w:pPr>
+      <w:r>
+        <w:rPr>
+          <w:color w:val="0055AA"/>
+          <w:sz w:val="20"/>
+        </w:rPr>
+        <w:t>Sottotitolo: "~30' teoria · ~10' esercizio · ~10' confronto"</w:t>
+      </w:r>
+    </w:p>
+    <w:p/>
+    <w:p>
+      <w:r>
+        <w:t>**CATERINA:** La nostra agenda di oggi. In circa 50 minuti copriremo quattro aree: partiremo dall'ecosistema generale e dai consumi, per poi entrare nel vivo della gestione dei file e di come ottimizzare i prompt. Chiuderemo con un aspetto fondamentale: etica e inclusività.</w:t>
+      </w:r>
+    </w:p>
+    <w:p/>
+    <w:p>
+      <w:r>
+        <w:t>**ALBERTO:** Ovviamente, sentitevi liberi di intervenire con domande o riflessioni in qualsiasi momento.</w:t>
+      </w:r>
+    </w:p>
     <w:p/>
     <w:p>
       <w:r>
         <w:rPr>
-          <w:b/>
-          <w:color w:val="880088"/>
-          <w:sz w:val="22"/>
+          <w:i/>
+          <w:color w:val="555555"/>
+          <w:sz w:val="20"/>
         </w:rPr>
-        <w:t xml:space="preserve">CATERINA: </w:t>
-      </w:r>
-      <w:r>
-        <w:rPr>
-          <w:sz w:val="22"/>
-        </w:rPr>
-        <w:t>La nostra agenda di oggi. In circa 50 minuti copriremo quattro aree: partiremo dall'ecosistema generale e dai consumi, per poi entrare nel vivo della gestione dei file e di come ottimizzare i prompt. Chiuderemo con un aspetto fondamentale: etica e inclusività.</w:t>
+        <w:t>**[slide →]**</w:t>
       </w:r>
     </w:p>
+    <w:p/>
     <w:p>
       <w:r>
         <w:rPr>
-          <w:b/>
-          <w:color w:val="F00A0A"/>
-          <w:sz w:val="22"/>
+          <w:color w:val="555555"/>
+          <w:sz w:val="16"/>
         </w:rPr>
-        <w:t xml:space="preserve">ALBERTO: </w:t>
-      </w:r>
-      <w:r>
-        <w:rPr>
-          <w:sz w:val="22"/>
-        </w:rPr>
-        <w:t>Ovviamente, sentitevi liberi di intervenire con domande o riflessioni in qualsiasi momento.</w:t>
+        <w:t>──────────────────────────────────────────────────────────────────────</w:t>
       </w:r>
     </w:p>
     <w:p/>
     <w:p>
       <w:pPr>
-        <w:pStyle w:val="Heading3"/>
+        <w:pStyle w:val="Heading2"/>
       </w:pPr>
       <w:r>
         <w:rPr>
-          <w:color w:val="F00A0A"/>
-          <w:sz w:val="24"/>
+          <w:color w:val="06006B"/>
+          <w:sz w:val="30"/>
         </w:rPr>
         <w:t>SLIDE 3 — ROMPIGHIACCIO</w:t>
       </w:r>
@@ -294,26 +310,28 @@
           <w:color w:val="0055AA"/>
           <w:sz w:val="20"/>
         </w:rPr>
-        <w:t>[schermo] "Prima di partire — Alzate la mano: chi ha già usato un tool di AI al lavoro?" (ChatGPT · Copilot · Gemini · Midjourney)</w:t>
+        <w:t>[schermo] "Prima di partire — Alzate la mano: chi ha già usato un tool di AI al lavoro?"</w:t>
+      </w:r>
+    </w:p>
+    <w:p>
+      <w:pPr>
+        <w:ind w:left="432"/>
+      </w:pPr>
+      <w:r>
+        <w:rPr>
+          <w:color w:val="0055AA"/>
+          <w:sz w:val="20"/>
+        </w:rPr>
+        <w:t>Opzioni: ChatGPT · Copilot · Gemini · Midjourney · anche solo per un'email</w:t>
       </w:r>
     </w:p>
     <w:p/>
     <w:p>
       <w:r>
-        <w:rPr>
-          <w:b/>
-          <w:color w:val="880088"/>
-          <w:sz w:val="22"/>
-        </w:rPr>
-        <w:t xml:space="preserve">CATERINA: </w:t>
-      </w:r>
-      <w:r>
-        <w:rPr>
-          <w:sz w:val="22"/>
-        </w:rPr>
-        <w:t>Prima di entrare nel vivo, ci piacerebbe capire da dove partiamo. Quanti di voi usano già strumenti come ChatGPT, Copilot, Gemini o simili nel lavoro quotidiano?</w:t>
+        <w:t>**CATERINA:** Prima di entrare nel vivo, ci piacerebbe capire da dove partiamo. Quanti di voi usano già strumenti come ChatGPT, Copilot, Gemini o simili nel lavoro quotidiano?</w:t>
       </w:r>
     </w:p>
+    <w:p/>
     <w:p>
       <w:r>
         <w:rPr>
@@ -321,54 +339,22 @@
           <w:color w:val="555555"/>
           <w:sz w:val="20"/>
         </w:rPr>
-        <w:t>(aspetta le mani, osserva la sala)</w:t>
-      </w:r>
-    </w:p>
-    <w:p>
-      <w:r>
-        <w:rPr>
-          <w:b/>
-          <w:color w:val="06006B"/>
-          <w:sz w:val="22"/>
-        </w:rPr>
-        <w:t xml:space="preserve">SARA: </w:t>
-      </w:r>
-      <w:r>
-        <w:rPr>
-          <w:sz w:val="22"/>
-        </w:rPr>
-        <w:t>Ottimo. E per chi non ha ancora avuto modo di esplorarli, l'obiettivo di oggi è proprio fornirvi le basi per iniziare in modo efficace.</w:t>
-      </w:r>
-    </w:p>
-    <w:p>
-      <w:r>
-        <w:rPr>
-          <w:b/>
-          <w:color w:val="F00A0A"/>
-          <w:sz w:val="22"/>
-        </w:rPr>
-        <w:t xml:space="preserve">ALBERTO: </w:t>
-      </w:r>
-      <w:r>
-        <w:rPr>
-          <w:sz w:val="22"/>
-        </w:rPr>
-        <w:t>Iniziamo ad allineare il nostro vocabolario.</w:t>
+        <w:t>*(aspetta le mani, osserva la sala)*</w:t>
       </w:r>
     </w:p>
     <w:p/>
     <w:p>
-      <w:pPr>
-        <w:pStyle w:val="Heading3"/>
-      </w:pPr>
       <w:r>
-        <w:rPr>
-          <w:color w:val="F00A0A"/>
-          <w:sz w:val="24"/>
-        </w:rPr>
-        <w:t>SLIDE 4 — SEZIONE 01: ECOSISTEMA AI &amp; CONSUMI</w:t>
+        <w:t>**SARA:** Ottimo. E per chi non ha ancora avuto modo di esplorarli, l'obiettivo di oggi è proprio fornirvi le basi per iniziare in modo efficace.</w:t>
       </w:r>
     </w:p>
+    <w:p/>
+    <w:p>
+      <w:r>
+        <w:t>**ALBERTO:** Iniziamo ad allineare il nostro vocabolario.</w:t>
+      </w:r>
+    </w:p>
+    <w:p/>
     <w:p>
       <w:r>
         <w:rPr>
@@ -376,18 +362,97 @@
           <w:color w:val="555555"/>
           <w:sz w:val="20"/>
         </w:rPr>
-        <w:t>(cambio di sezione)</w:t>
+        <w:t>**[slide →]**</w:t>
+      </w:r>
+    </w:p>
+    <w:p/>
+    <w:p>
+      <w:r>
+        <w:rPr>
+          <w:color w:val="555555"/>
+          <w:sz w:val="16"/>
+        </w:rPr>
+        <w:t>──────────────────────────────────────────────────────────────────────</w:t>
       </w:r>
     </w:p>
     <w:p/>
     <w:p>
       <w:pPr>
-        <w:pStyle w:val="Heading3"/>
+        <w:pStyle w:val="Heading2"/>
       </w:pPr>
       <w:r>
         <w:rPr>
-          <w:color w:val="F00A0A"/>
-          <w:sz w:val="24"/>
+          <w:color w:val="06006B"/>
+          <w:sz w:val="30"/>
+        </w:rPr>
+        <w:t>SLIDE 4 — SEZIONE 01: ECOSISTEMA AI &amp; CONSUMI</w:t>
+      </w:r>
+    </w:p>
+    <w:p>
+      <w:pPr>
+        <w:ind w:left="432"/>
+      </w:pPr>
+      <w:r>
+        <w:rPr>
+          <w:color w:val="0055AA"/>
+          <w:sz w:val="20"/>
+        </w:rPr>
+        <w:t>[schermo] Intestazione sezione: "01 — Ecosistema AI &amp; Consumi"</w:t>
+      </w:r>
+    </w:p>
+    <w:p>
+      <w:pPr>
+        <w:ind w:left="432"/>
+      </w:pPr>
+      <w:r>
+        <w:rPr>
+          <w:color w:val="0055AA"/>
+          <w:sz w:val="20"/>
+        </w:rPr>
+        <w:t>Sottotitolo: "Cos'è l'AI, chi sono i player, quanto consuma un prompt"</w:t>
+      </w:r>
+    </w:p>
+    <w:p/>
+    <w:p>
+      <w:r>
+        <w:rPr>
+          <w:i/>
+          <w:color w:val="555555"/>
+          <w:sz w:val="20"/>
+        </w:rPr>
+        <w:t>*(cambio di sezione)*</w:t>
+      </w:r>
+    </w:p>
+    <w:p/>
+    <w:p>
+      <w:r>
+        <w:rPr>
+          <w:i/>
+          <w:color w:val="555555"/>
+          <w:sz w:val="20"/>
+        </w:rPr>
+        <w:t>**[slide →]**</w:t>
+      </w:r>
+    </w:p>
+    <w:p/>
+    <w:p>
+      <w:r>
+        <w:rPr>
+          <w:color w:val="555555"/>
+          <w:sz w:val="16"/>
+        </w:rPr>
+        <w:t>──────────────────────────────────────────────────────────────────────</w:t>
+      </w:r>
+    </w:p>
+    <w:p/>
+    <w:p>
+      <w:pPr>
+        <w:pStyle w:val="Heading2"/>
+      </w:pPr>
+      <w:r>
+        <w:rPr>
+          <w:color w:val="06006B"/>
+          <w:sz w:val="30"/>
         </w:rPr>
         <w:t>SLIDE 5 — ECOSISTEMA: I PLAYER</w:t>
       </w:r>
@@ -401,79 +466,57 @@
           <w:color w:val="0055AA"/>
           <w:sz w:val="20"/>
         </w:rPr>
-        <w:t>[schermo] AI Generativa: ChatGPT/OpenAI, Claude/Anthropic, Gemini/Google, Copilot/Microsoft, Midjourney/DALL·E</w:t>
+        <w:t>[schermo] Due colonne: AI Generativa (ChatGPT/OpenAI, Claude/Anthropic, Gemini/Google, Copilot/Microsoft, Midjourney/DALL·E) | AI "Classica" (filtro spam, Netflix, Face ID, traduzione automatica)</w:t>
       </w:r>
     </w:p>
+    <w:p/>
     <w:p>
-      <w:pPr>
-        <w:ind w:left="432"/>
-      </w:pPr>
       <w:r>
-        <w:rPr>
-          <w:color w:val="0055AA"/>
-          <w:sz w:val="20"/>
-        </w:rPr>
-        <w:t>[schermo] AI Classica: filtro spam, Netflix, Face ID, traduzione automatica</w:t>
+        <w:t>**SARA:** Quando parliamo di "AI", spesso facciamo confusione tra due famiglie distinte.</w:t>
+      </w:r>
+    </w:p>
+    <w:p/>
+    <w:p>
+      <w:r>
+        <w:t>**ALBERTO:** L'AI generativa — quella che crea testi, immagini e codice in modo dinamico — è il focus di oggi. Parliamo dei modelli di OpenAI (ChatGPT), Anthropic (Claude), Google (Gemini) e Microsoft (Copilot).</w:t>
+      </w:r>
+    </w:p>
+    <w:p/>
+    <w:p>
+      <w:r>
+        <w:t>**SARA:** Poi c'è l'AI "analitica" o classica, che usiamo già da anni: il riconoscimento facciale degli smartphone, i filtri antispam, i suggerimenti di Netflix. L'AI generativa rappresenta uno step successivo: non classifica solo i dati, ma produce contenuti nuovi.</w:t>
       </w:r>
     </w:p>
     <w:p/>
     <w:p>
       <w:r>
         <w:rPr>
-          <w:b/>
-          <w:color w:val="06006B"/>
-          <w:sz w:val="22"/>
+          <w:i/>
+          <w:color w:val="555555"/>
+          <w:sz w:val="20"/>
         </w:rPr>
-        <w:t xml:space="preserve">SARA: </w:t>
-      </w:r>
-      <w:r>
-        <w:rPr>
-          <w:sz w:val="22"/>
-        </w:rPr>
-        <w:t>Quando parliamo di "AI", spesso facciamo confusione tra due famiglie distinte.</w:t>
+        <w:t>**[slide →]**</w:t>
       </w:r>
     </w:p>
+    <w:p/>
     <w:p>
       <w:r>
         <w:rPr>
-          <w:b/>
-          <w:color w:val="F00A0A"/>
-          <w:sz w:val="22"/>
+          <w:color w:val="555555"/>
+          <w:sz w:val="16"/>
         </w:rPr>
-        <w:t xml:space="preserve">ALBERTO: </w:t>
-      </w:r>
-      <w:r>
-        <w:rPr>
-          <w:sz w:val="22"/>
-        </w:rPr>
-        <w:t>L'AI generativa — quella che crea testi, immagini e codice in modo dinamico — è il focus di oggi. Parliamo dei modelli di OpenAI (ChatGPT), Anthropic (Claude), Google (Gemini) e Microsoft (Copilot).</w:t>
-      </w:r>
-    </w:p>
-    <w:p>
-      <w:r>
-        <w:rPr>
-          <w:b/>
-          <w:color w:val="06006B"/>
-          <w:sz w:val="22"/>
-        </w:rPr>
-        <w:t xml:space="preserve">SARA: </w:t>
-      </w:r>
-      <w:r>
-        <w:rPr>
-          <w:sz w:val="22"/>
-        </w:rPr>
-        <w:t>Poi c'è l'AI "analitica" o classica, che usiamo già da anni: il riconoscimento facciale degli smartphone, i filtri antispam, i suggerimenti di Netflix. L'AI generativa rappresenta uno step successivo: non classifica solo i dati, ma produce contenuti nuovi.</w:t>
+        <w:t>──────────────────────────────────────────────────────────────────────</w:t>
       </w:r>
     </w:p>
     <w:p/>
     <w:p>
       <w:pPr>
-        <w:pStyle w:val="Heading3"/>
+        <w:pStyle w:val="Heading2"/>
       </w:pPr>
       <w:r>
         <w:rPr>
-          <w:color w:val="F00A0A"/>
-          <w:sz w:val="24"/>
+          <w:color w:val="06006B"/>
+          <w:sz w:val="30"/>
         </w:rPr>
         <w:t>SLIDE 6 — COME FUNZIONA? IN PAROLE SEMPLICI</w:t>
       </w:r>
@@ -487,83 +530,87 @@
           <w:color w:val="0055AA"/>
           <w:sz w:val="20"/>
         </w:rPr>
-        <w:t>[schermo] Spiegazione senza jargon + analogia autocomplete + 3 bullet: no coscienza / può sbagliare / il contesto cambia tutto</w:t>
+        <w:t>[schermo] Due colonne</w:t>
+      </w:r>
+    </w:p>
+    <w:p>
+      <w:pPr>
+        <w:ind w:left="432"/>
+      </w:pPr>
+      <w:r>
+        <w:rPr>
+          <w:color w:val="0055AA"/>
+          <w:sz w:val="20"/>
+        </w:rPr>
+        <w:t>Sinistra: spiegazione in italiano semplice — "ChatGPT, Claude, Gemini — modelli addestrati su enormi quantità di testo. Non 'pensano' come noi. Predicono quale parola viene dopo."</w:t>
+      </w:r>
+    </w:p>
+    <w:p>
+      <w:pPr>
+        <w:ind w:left="432"/>
+      </w:pPr>
+      <w:r>
+        <w:rPr>
+          <w:color w:val="0055AA"/>
+          <w:sz w:val="20"/>
+        </w:rPr>
+        <w:t>Destra: Callout "Analogia: è come un autocomplete avanzatissimo che ha letto tutto internet" + bullet: Non ha coscienza / Può sbagliare con sicurezza / Il contesto che gli date cambia tutto</w:t>
+      </w:r>
+    </w:p>
+    <w:p/>
+    <w:p>
+      <w:r>
+        <w:t>**GAIA:** Per usare bene questi strumenti, dobbiamo capire cosa c'è sotto il cofano.</w:t>
+      </w:r>
+    </w:p>
+    <w:p/>
+    <w:p>
+      <w:r>
+        <w:t>**GAIA:** I Modelli Linguistici di Grandi Dimensioni (LLM) sono stati addestrati su enormi porzioni di internet, libri e articoli. Il loro compito principale, semplificando, è calcolare statisticamente quale parola ha più senso inserire dopo la precedente.</w:t>
+      </w:r>
+    </w:p>
+    <w:p/>
+    <w:p>
+      <w:r>
+        <w:t>**CATERINA:** È importante ricordare che non hanno un "pensiero" proprio, né una reale comprensione semantica. Sono meccanismi di predizione estremamente sofisticati.</w:t>
+      </w:r>
+    </w:p>
+    <w:p/>
+    <w:p>
+      <w:r>
+        <w:t>**ALBERTO:** Questo significa che sono soggetti ad "allucinazioni": possono produrre risposte completamente errate, ma formulate in modo molto autorevole e convincente. Per questo la verifica umana rimane essenziale.</w:t>
       </w:r>
     </w:p>
     <w:p/>
     <w:p>
       <w:r>
         <w:rPr>
-          <w:b/>
-          <w:color w:val="008844"/>
-          <w:sz w:val="22"/>
+          <w:i/>
+          <w:color w:val="555555"/>
+          <w:sz w:val="20"/>
         </w:rPr>
-        <w:t xml:space="preserve">GAIA: </w:t>
-      </w:r>
-      <w:r>
-        <w:rPr>
-          <w:sz w:val="22"/>
-        </w:rPr>
-        <w:t>Per usare bene questi strumenti, dobbiamo capire cosa c'è sotto il cofano.</w:t>
+        <w:t>**[slide →]**</w:t>
       </w:r>
     </w:p>
+    <w:p/>
     <w:p>
       <w:r>
         <w:rPr>
-          <w:b/>
-          <w:color w:val="008844"/>
-          <w:sz w:val="22"/>
+          <w:color w:val="555555"/>
+          <w:sz w:val="16"/>
         </w:rPr>
-        <w:t xml:space="preserve">GAIA: </w:t>
-      </w:r>
-      <w:r>
-        <w:rPr>
-          <w:sz w:val="22"/>
-        </w:rPr>
-        <w:t>I Modelli Linguistici di Grandi Dimensioni (LLM) sono stati addestrati su enormi porzioni di internet, libri e articoli. Il loro compito principale, semplificando, è calcolare statisticamente quale parola ha più senso inserire dopo la precedente.</w:t>
-      </w:r>
-    </w:p>
-    <w:p>
-      <w:r>
-        <w:rPr>
-          <w:b/>
-          <w:color w:val="880088"/>
-          <w:sz w:val="22"/>
-        </w:rPr>
-        <w:t xml:space="preserve">CATERINA: </w:t>
-      </w:r>
-      <w:r>
-        <w:rPr>
-          <w:sz w:val="22"/>
-        </w:rPr>
-        <w:t>È importante ricordare che non hanno un "pensiero" proprio, né una reale comprensione semantica. Sono meccanismi di predizione estremamente sofisticati.</w:t>
-      </w:r>
-    </w:p>
-    <w:p>
-      <w:r>
-        <w:rPr>
-          <w:b/>
-          <w:color w:val="F00A0A"/>
-          <w:sz w:val="22"/>
-        </w:rPr>
-        <w:t xml:space="preserve">ALBERTO: </w:t>
-      </w:r>
-      <w:r>
-        <w:rPr>
-          <w:sz w:val="22"/>
-        </w:rPr>
-        <w:t>Questo significa che sono soggetti ad "allucinazioni": possono produrre risposte completamente errate, ma formulate in modo molto autorevole e convincente. Per questo la verifica umana rimane essenziale.</w:t>
+        <w:t>──────────────────────────────────────────────────────────────────────</w:t>
       </w:r>
     </w:p>
     <w:p/>
     <w:p>
       <w:pPr>
-        <w:pStyle w:val="Heading3"/>
+        <w:pStyle w:val="Heading2"/>
       </w:pPr>
       <w:r>
         <w:rPr>
-          <w:color w:val="F00A0A"/>
-          <w:sz w:val="24"/>
+          <w:color w:val="06006B"/>
+          <w:sz w:val="30"/>
         </w:rPr>
         <w:t>SLIDE 7 — SOSTENIBILITÀ E CONSUMI</w:t>
       </w:r>
@@ -577,83 +624,75 @@
           <w:color w:val="0055AA"/>
           <w:sz w:val="20"/>
         </w:rPr>
-        <w:t>[schermo] Tabella: Prompt (~5-10x Google) | Training (energia significativa una tantum) | Scala (miliardi/giorno). Fonte: SciTechDaily.</w:t>
+        <w:t>[schermo] Tabella comparativa con 3 righe colorate: ✅ Prompt (~5-10x ricerca Google, molto meno del previsto) | ⚠️ Training (energia significativa una tantum) | ❌ Scala (miliardi di richieste/giorno: il volume fa la differenza)</w:t>
+      </w:r>
+    </w:p>
+    <w:p>
+      <w:pPr>
+        <w:ind w:left="432"/>
+      </w:pPr>
+      <w:r>
+        <w:rPr>
+          <w:color w:val="0055AA"/>
+          <w:sz w:val="20"/>
+        </w:rPr>
+        <w:t>Colonna destra: Callout con fonte SciTechDaily</w:t>
+      </w:r>
+    </w:p>
+    <w:p/>
+    <w:p>
+      <w:r>
+        <w:t>**GAIA:** Un tema molto dibattuto è l'impatto energetico dell'AI. Spesso leggiamo notizie allarmistiche, ma i dati ci aiutano a contestualizzare.</w:t>
+      </w:r>
+    </w:p>
+    <w:p/>
+    <w:p>
+      <w:r>
+        <w:t>**CATERINA:** Come evidenzia un recente studio di SciTechDaily, l'energia richiesta per una singola generazione (un "prompt") equivale a circa 5-10 ricerche Google. Non è un impatto trascurabile, ma è inferiore a quanto viene spesso percepito.</w:t>
+      </w:r>
+    </w:p>
+    <w:p/>
+    <w:p>
+      <w:r>
+        <w:t>**GAIA:** Il vero impatto si verifica durante la fase di "addestramento" del modello, che richiede enormi risorse di calcolo, e naturalmente dalla "scala" globale: miliardi di query ogni giorno richiedono server farm immense.</w:t>
+      </w:r>
+    </w:p>
+    <w:p/>
+    <w:p>
+      <w:r>
+        <w:t>**CATERINA:** Da qui l'importanza di un "Prompt Engineering" efficace: formulare richieste precise significa ridurre il numero di tentativi e iterazioni, ottimizzando sia il nostro tempo che le risorse energetiche.</w:t>
       </w:r>
     </w:p>
     <w:p/>
     <w:p>
       <w:r>
         <w:rPr>
-          <w:b/>
-          <w:color w:val="008844"/>
-          <w:sz w:val="22"/>
+          <w:i/>
+          <w:color w:val="555555"/>
+          <w:sz w:val="20"/>
         </w:rPr>
-        <w:t xml:space="preserve">GAIA: </w:t>
-      </w:r>
-      <w:r>
-        <w:rPr>
-          <w:sz w:val="22"/>
-        </w:rPr>
-        <w:t>Un tema molto dibattuto è l'impatto energetico dell'AI. Spesso leggiamo notizie allarmistiche, ma i dati ci aiutano a contestualizzare.</w:t>
+        <w:t>**[slide →]**</w:t>
       </w:r>
     </w:p>
+    <w:p/>
     <w:p>
       <w:r>
         <w:rPr>
-          <w:b/>
-          <w:color w:val="880088"/>
-          <w:sz w:val="22"/>
+          <w:color w:val="555555"/>
+          <w:sz w:val="16"/>
         </w:rPr>
-        <w:t xml:space="preserve">CATERINA: </w:t>
-      </w:r>
-      <w:r>
-        <w:rPr>
-          <w:sz w:val="22"/>
-        </w:rPr>
-        <w:t>Come evidenzia un recente studio di SciTechDaily, l'energia richiesta per una singola generazione (un "prompt") equivale a circa 5-10 ricerche Google. Non è un impatto trascurabile, ma è inferiore a quanto viene spesso percepito.</w:t>
-      </w:r>
-    </w:p>
-    <w:p>
-      <w:r>
-        <w:rPr>
-          <w:b/>
-          <w:color w:val="008844"/>
-          <w:sz w:val="22"/>
-        </w:rPr>
-        <w:t xml:space="preserve">GAIA: </w:t>
-      </w:r>
-      <w:r>
-        <w:rPr>
-          <w:sz w:val="22"/>
-        </w:rPr>
-        <w:t>Il vero impatto si verifica durante la fase di "addestramento" del modello, che richiede enormi risorse di calcolo, e naturalmente dalla "scala" globale: miliardi di query ogni giorno richiedono server farm immense.</w:t>
-      </w:r>
-    </w:p>
-    <w:p>
-      <w:r>
-        <w:rPr>
-          <w:b/>
-          <w:color w:val="880088"/>
-          <w:sz w:val="22"/>
-        </w:rPr>
-        <w:t xml:space="preserve">CATERINA: </w:t>
-      </w:r>
-      <w:r>
-        <w:rPr>
-          <w:sz w:val="22"/>
-        </w:rPr>
-        <w:t>Da qui l'importanza di un "Prompt Engineering" efficace: formulare richieste precise significa ridurre il numero di tentativi e iterazioni, ottimizzando sia il nostro tempo che le risorse energetiche.</w:t>
+        <w:t>──────────────────────────────────────────────────────────────────────</w:t>
       </w:r>
     </w:p>
     <w:p/>
     <w:p>
       <w:pPr>
-        <w:pStyle w:val="Heading3"/>
+        <w:pStyle w:val="Heading2"/>
       </w:pPr>
       <w:r>
         <w:rPr>
-          <w:color w:val="F00A0A"/>
-          <w:sz w:val="24"/>
+          <w:color w:val="06006B"/>
+          <w:sz w:val="30"/>
         </w:rPr>
         <w:t>SLIDE 8 — QUIZ: QUANTO CONSUMA UN PROMPT?</w:t>
       </w:r>
@@ -667,26 +706,28 @@
           <w:color w:val="0055AA"/>
           <w:sz w:val="20"/>
         </w:rPr>
-        <w:t>[schermo] A) ☕ Fare un caffè espresso   B) 🔍 5–10 ricerche Google (non 1.000)   C) ✈️ Un decimo di un volo Milano-Roma</w:t>
+        <w:t>[schermo] Grande domanda: "Un prompt a ChatGPT consuma circa quanto…?"</w:t>
+      </w:r>
+    </w:p>
+    <w:p>
+      <w:pPr>
+        <w:ind w:left="432"/>
+      </w:pPr>
+      <w:r>
+        <w:rPr>
+          <w:color w:val="0055AA"/>
+          <w:sz w:val="20"/>
+        </w:rPr>
+        <w:t>A) ☕ Fare un caffè espresso | B) 🔍 5–10 ricerche Google | C) ✈️ Un decimo di un volo Milano-Roma</w:t>
       </w:r>
     </w:p>
     <w:p/>
     <w:p>
       <w:r>
-        <w:rPr>
-          <w:b/>
-          <w:color w:val="F00A0A"/>
-          <w:sz w:val="22"/>
-        </w:rPr>
-        <w:t xml:space="preserve">ALBERTO: </w:t>
-      </w:r>
-      <w:r>
-        <w:rPr>
-          <w:sz w:val="22"/>
-        </w:rPr>
-        <w:t>Vi proponiamo un piccolo sondaggio. Secondo voi, in termini di energia, un prompt equivale a...?</w:t>
+        <w:t>**ALBERTO:** Vi proponiamo un piccolo sondaggio. Secondo voi, in termini di energia, un prompt equivale a...?</w:t>
       </w:r>
     </w:p>
+    <w:p/>
     <w:p>
       <w:r>
         <w:rPr>
@@ -694,54 +735,22 @@
           <w:color w:val="555555"/>
           <w:sz w:val="20"/>
         </w:rPr>
-        <w:t>(aspetta le risposte dal pubblico — 30 sec)</w:t>
-      </w:r>
-    </w:p>
-    <w:p>
-      <w:r>
-        <w:rPr>
-          <w:b/>
-          <w:color w:val="F00A0A"/>
-          <w:sz w:val="22"/>
-        </w:rPr>
-        <w:t xml:space="preserve">ALBERTO: </w:t>
-      </w:r>
-      <w:r>
-        <w:rPr>
-          <w:sz w:val="22"/>
-        </w:rPr>
-        <w:t>La risposta è la B, circa 5-10 ricerche Google. Spesso la percezione è molto più alta a causa del modo in cui i media ne parlano.</w:t>
-      </w:r>
-    </w:p>
-    <w:p>
-      <w:r>
-        <w:rPr>
-          <w:b/>
-          <w:color w:val="06006B"/>
-          <w:sz w:val="22"/>
-        </w:rPr>
-        <w:t xml:space="preserve">SARA: </w:t>
-      </w:r>
-      <w:r>
-        <w:rPr>
-          <w:sz w:val="22"/>
-        </w:rPr>
-        <w:t>L'obiettivo non è scoraggiarne l'uso, ma promuovere un approccio consapevole e strutturato.</w:t>
+        <w:t>*(aspetta le risposte dal pubblico — 30 sec)*</w:t>
       </w:r>
     </w:p>
     <w:p/>
     <w:p>
-      <w:pPr>
-        <w:pStyle w:val="Heading3"/>
-      </w:pPr>
       <w:r>
-        <w:rPr>
-          <w:color w:val="F00A0A"/>
-          <w:sz w:val="24"/>
-        </w:rPr>
-        <w:t>SLIDE 9 — SEZIONE 02: GESTIONE DEI FILE</w:t>
+        <w:t>**ALBERTO:** La risposta è la B, circa 5-10 ricerche Google. Spesso la percezione è molto più alta a causa del modo in cui i media ne parlano.</w:t>
       </w:r>
     </w:p>
+    <w:p/>
+    <w:p>
+      <w:r>
+        <w:t>**SARA:** L'obiettivo non è scoraggiarne l'uso, ma promuovere un approccio consapevole e strutturato.</w:t>
+      </w:r>
+    </w:p>
+    <w:p/>
     <w:p>
       <w:r>
         <w:rPr>
@@ -749,18 +758,86 @@
           <w:color w:val="555555"/>
           <w:sz w:val="20"/>
         </w:rPr>
-        <w:t>(cambio di sezione)</w:t>
+        <w:t>**[slide →]**</w:t>
+      </w:r>
+    </w:p>
+    <w:p/>
+    <w:p>
+      <w:r>
+        <w:rPr>
+          <w:color w:val="555555"/>
+          <w:sz w:val="16"/>
+        </w:rPr>
+        <w:t>──────────────────────────────────────────────────────────────────────</w:t>
       </w:r>
     </w:p>
     <w:p/>
     <w:p>
       <w:pPr>
-        <w:pStyle w:val="Heading3"/>
+        <w:pStyle w:val="Heading2"/>
       </w:pPr>
       <w:r>
         <w:rPr>
-          <w:color w:val="F00A0A"/>
-          <w:sz w:val="24"/>
+          <w:color w:val="06006B"/>
+          <w:sz w:val="30"/>
+        </w:rPr>
+        <w:t>SLIDE 9 — SEZIONE 02: GESTIONE DEI FILE</w:t>
+      </w:r>
+    </w:p>
+    <w:p>
+      <w:pPr>
+        <w:ind w:left="432"/>
+      </w:pPr>
+      <w:r>
+        <w:rPr>
+          <w:color w:val="0055AA"/>
+          <w:sz w:val="20"/>
+        </w:rPr>
+        <w:t>[schermo] Intestazione sezione: "02 — Gestione dei File"</w:t>
+      </w:r>
+    </w:p>
+    <w:p>
+      <w:pPr>
+        <w:ind w:left="432"/>
+      </w:pPr>
+      <w:r>
+        <w:rPr>
+          <w:color w:val="0055AA"/>
+          <w:sz w:val="20"/>
+        </w:rPr>
+        <w:t>Sottotitolo: "Cosa dare da elaborare all'AI — e in che formato"</w:t>
+      </w:r>
+    </w:p>
+    <w:p/>
+    <w:p>
+      <w:r>
+        <w:rPr>
+          <w:i/>
+          <w:color w:val="555555"/>
+          <w:sz w:val="20"/>
+        </w:rPr>
+        <w:t>**[slide →]**</w:t>
+      </w:r>
+    </w:p>
+    <w:p/>
+    <w:p>
+      <w:r>
+        <w:rPr>
+          <w:color w:val="555555"/>
+          <w:sz w:val="16"/>
+        </w:rPr>
+        <w:t>──────────────────────────────────────────────────────────────────────</w:t>
+      </w:r>
+    </w:p>
+    <w:p/>
+    <w:p>
+      <w:pPr>
+        <w:pStyle w:val="Heading2"/>
+      </w:pPr>
+      <w:r>
+        <w:rPr>
+          <w:color w:val="06006B"/>
+          <w:sz w:val="30"/>
         </w:rPr>
         <w:t>SLIDE 10 — FORMATI FILE</w:t>
       </w:r>
@@ -774,83 +851,111 @@
           <w:color w:val="0055AA"/>
           <w:sz w:val="20"/>
         </w:rPr>
-        <w:t>[schermo] ✅ .md .txt .csv (ottimali) | ⚠️ .pdf .docx (accettabili) | ❌ PDF scansionati | ❌ .xlsx con formule</w:t>
+        <w:t>[schermo] Tabella 4 righe:</w:t>
+      </w:r>
+    </w:p>
+    <w:p>
+      <w:pPr>
+        <w:ind w:left="432"/>
+      </w:pPr>
+      <w:r>
+        <w:rPr>
+          <w:color w:val="0055AA"/>
+          <w:sz w:val="20"/>
+        </w:rPr>
+        <w:t>✅ .md .txt .csv — ottimali, testo puro strutturato</w:t>
+      </w:r>
+    </w:p>
+    <w:p>
+      <w:pPr>
+        <w:ind w:left="432"/>
+      </w:pPr>
+      <w:r>
+        <w:rPr>
+          <w:color w:val="0055AA"/>
+          <w:sz w:val="20"/>
+        </w:rPr>
+        <w:t>⚠️ .pdf .docx — accettabili se non protetti e testuali</w:t>
+      </w:r>
+    </w:p>
+    <w:p>
+      <w:pPr>
+        <w:ind w:left="432"/>
+      </w:pPr>
+      <w:r>
+        <w:rPr>
+          <w:color w:val="0055AA"/>
+          <w:sz w:val="20"/>
+        </w:rPr>
+        <w:t>❌ PDF scansionati — inefficaci</w:t>
+      </w:r>
+    </w:p>
+    <w:p>
+      <w:pPr>
+        <w:ind w:left="432"/>
+      </w:pPr>
+      <w:r>
+        <w:rPr>
+          <w:color w:val="0055AA"/>
+          <w:sz w:val="20"/>
+        </w:rPr>
+        <w:t>❌ .xlsx con formule — la logica non è visibile all'AI testuale</w:t>
+      </w:r>
+    </w:p>
+    <w:p/>
+    <w:p>
+      <w:r>
+        <w:t>**CATERINA:** Cambiamo argomento. Spesso lavoriamo fornendo documenti all'AI per farli analizzare, riassumere o usare come contesto. La scelta del formato è determinante.</w:t>
+      </w:r>
+    </w:p>
+    <w:p/>
+    <w:p>
+      <w:r>
+        <w:t>**SARA:** L'AI ragiona in termini di testo. Qualsiasi elemento di formattazione visiva complessa rischia di creare "rumore" o di perdersi.</w:t>
+      </w:r>
+    </w:p>
+    <w:p/>
+    <w:p>
+      <w:r>
+        <w:t>**CATERINA:** I formati ideali sono il testo puro e strutturato: `.txt`, `.csv` per i dati, e in particolare il formato `.md` (Markdown). Meno efficaci sono i PDF complessi o scansionati, e i file Excel in cui il valore deriva da formule nascoste che l'AI non può sempre interpretare.</w:t>
+      </w:r>
+    </w:p>
+    <w:p/>
+    <w:p>
+      <w:r>
+        <w:t>**ALBERTO:** Per ottenere risultati eccellenti, dovremmo abituarci a "pulire" le informazioni prima di darle in pasto all'AI.</w:t>
       </w:r>
     </w:p>
     <w:p/>
     <w:p>
       <w:r>
         <w:rPr>
-          <w:b/>
-          <w:color w:val="880088"/>
-          <w:sz w:val="22"/>
+          <w:i/>
+          <w:color w:val="555555"/>
+          <w:sz w:val="20"/>
         </w:rPr>
-        <w:t xml:space="preserve">CATERINA: </w:t>
-      </w:r>
-      <w:r>
-        <w:rPr>
-          <w:sz w:val="22"/>
-        </w:rPr>
-        <w:t>Cambiamo argomento. Spesso lavoriamo fornendo documenti all'AI per farli analizzare, riassumere o usare come contesto. La scelta del formato è determinante.</w:t>
+        <w:t>**[slide →]**</w:t>
       </w:r>
     </w:p>
+    <w:p/>
     <w:p>
       <w:r>
         <w:rPr>
-          <w:b/>
-          <w:color w:val="06006B"/>
-          <w:sz w:val="22"/>
+          <w:color w:val="555555"/>
+          <w:sz w:val="16"/>
         </w:rPr>
-        <w:t xml:space="preserve">SARA: </w:t>
-      </w:r>
-      <w:r>
-        <w:rPr>
-          <w:sz w:val="22"/>
-        </w:rPr>
-        <w:t>L'AI ragiona in termini di testo. Qualsiasi elemento di formattazione visiva complessa rischia di creare "rumore" o di perdersi.</w:t>
-      </w:r>
-    </w:p>
-    <w:p>
-      <w:r>
-        <w:rPr>
-          <w:b/>
-          <w:color w:val="880088"/>
-          <w:sz w:val="22"/>
-        </w:rPr>
-        <w:t xml:space="preserve">CATERINA: </w:t>
-      </w:r>
-      <w:r>
-        <w:rPr>
-          <w:sz w:val="22"/>
-        </w:rPr>
-        <w:t>I formati ideali sono il testo puro e strutturato: .txt, .csv per i dati, e in particolare il formato .md (Markdown). Meno efficaci sono i PDF complessi o scansionati, e i file Excel in cui il valore deriva da formule nascoste che l'AI non può sempre interpretare.</w:t>
-      </w:r>
-    </w:p>
-    <w:p>
-      <w:r>
-        <w:rPr>
-          <w:b/>
-          <w:color w:val="F00A0A"/>
-          <w:sz w:val="22"/>
-        </w:rPr>
-        <w:t xml:space="preserve">ALBERTO: </w:t>
-      </w:r>
-      <w:r>
-        <w:rPr>
-          <w:sz w:val="22"/>
-        </w:rPr>
-        <w:t>Per ottenere risultati eccellenti, dovremmo abituarci a "pulire" le informazioni prima di darle in pasto all'AI.</w:t>
+        <w:t>──────────────────────────────────────────────────────────────────────</w:t>
       </w:r>
     </w:p>
     <w:p/>
     <w:p>
       <w:pPr>
-        <w:pStyle w:val="Heading3"/>
+        <w:pStyle w:val="Heading2"/>
       </w:pPr>
       <w:r>
         <w:rPr>
-          <w:color w:val="F00A0A"/>
-          <w:sz w:val="24"/>
+          <w:color w:val="06006B"/>
+          <w:sz w:val="30"/>
         </w:rPr>
         <w:t>SLIDE 11 — QUIZ: COS'È UN FILE .MD?</w:t>
       </w:r>
@@ -864,102 +969,7 @@
           <w:color w:val="0055AA"/>
           <w:sz w:val="20"/>
         </w:rPr>
-        <w:t>[schermo] A) ⚙️ Un file di log di sistema   B) 🗄️ Un formato proprietario per database relazionali   C) 📝 Markdown — formato di testo puro con sintassi leggera</w:t>
-      </w:r>
-    </w:p>
-    <w:p/>
-    <w:p>
-      <w:r>
-        <w:rPr>
-          <w:b/>
-          <w:color w:val="F00A0A"/>
-          <w:sz w:val="22"/>
-        </w:rPr>
-        <w:t xml:space="preserve">ALBERTO: </w:t>
-      </w:r>
-      <w:r>
-        <w:rPr>
-          <w:sz w:val="22"/>
-        </w:rPr>
-        <w:t>A proposito di Markdown, quanti di voi sanno cosa rappresenta un file con estensione ".md"?</w:t>
-      </w:r>
-    </w:p>
-    <w:p>
-      <w:r>
-        <w:rPr>
-          <w:i/>
-          <w:color w:val="555555"/>
-          <w:sz w:val="20"/>
-        </w:rPr>
-        <w:t>(aspetta le risposte)</w:t>
-      </w:r>
-    </w:p>
-    <w:p>
-      <w:r>
-        <w:rPr>
-          <w:b/>
-          <w:color w:val="F00A0A"/>
-          <w:sz w:val="22"/>
-        </w:rPr>
-        <w:t xml:space="preserve">ALBERTO: </w:t>
-      </w:r>
-      <w:r>
-        <w:rPr>
-          <w:sz w:val="22"/>
-        </w:rPr>
-        <w:t>Esatto, è la C. Il Markdown è un formato di testo puro, inventato per formattare contenuti sul web usando solo caratteri standard: un cancelletto per i titoli, asterischi per il grassetto.</w:t>
-      </w:r>
-    </w:p>
-    <w:p>
-      <w:r>
-        <w:rPr>
-          <w:b/>
-          <w:color w:val="008844"/>
-          <w:sz w:val="22"/>
-        </w:rPr>
-        <w:t xml:space="preserve">GAIA: </w:t>
-      </w:r>
-      <w:r>
-        <w:rPr>
-          <w:sz w:val="22"/>
-        </w:rPr>
-        <w:t>Essendo puramente testuale ma altamente strutturato, è il formato che i modelli AI "digeriscono" meglio. Riduce le incomprensioni e aumenta la precisione delle analisi. Vi suggeriamo di iniziare a usarlo per i brief strutturati.</w:t>
-      </w:r>
-    </w:p>
-    <w:p/>
-    <w:p>
-      <w:pPr>
-        <w:pStyle w:val="Heading3"/>
-      </w:pPr>
-      <w:r>
-        <w:rPr>
-          <w:color w:val="F00A0A"/>
-          <w:sz w:val="24"/>
-        </w:rPr>
-        <w:t>SLIDE 12 — SEZIONE 03: PROMPT OPTIMIZATION</w:t>
-      </w:r>
-    </w:p>
-    <w:p>
-      <w:r>
-        <w:rPr>
-          <w:i/>
-          <w:color w:val="555555"/>
-          <w:sz w:val="20"/>
-        </w:rPr>
-        <w:t>(cambio di sezione)</w:t>
-      </w:r>
-    </w:p>
-    <w:p/>
-    <w:p>
-      <w:pPr>
-        <w:pStyle w:val="Heading3"/>
-      </w:pPr>
-      <w:r>
-        <w:rPr>
-          <w:color w:val="F00A0A"/>
-          <w:sz w:val="24"/>
-        </w:rPr>
-        <w:t>SLIDE 13 — IL PROMPT INEFFICACE (interattivo)</w:t>
+        <w:t>[schermo] "Sapete cos'è un file .md?"</w:t>
       </w:r>
     </w:p>
     <w:p>
@@ -971,95 +981,7 @@
           <w:color w:val="0055AA"/>
           <w:sz w:val="20"/>
         </w:rPr>
-        <w:t>[schermo] Riquadro rosso: "Crea una presentazione sull'AI" → output: generico, scolastico. 4 domande mancanti.</w:t>
-      </w:r>
-    </w:p>
-    <w:p/>
-    <w:p>
-      <w:r>
-        <w:rPr>
-          <w:b/>
-          <w:color w:val="06006B"/>
-          <w:sz w:val="22"/>
-        </w:rPr>
-        <w:t xml:space="preserve">SARA: </w:t>
-      </w:r>
-      <w:r>
-        <w:rPr>
-          <w:sz w:val="22"/>
-        </w:rPr>
-        <w:t>Arriviamo alla tecnica: il Prompt Engineering.</w:t>
-      </w:r>
-    </w:p>
-    <w:p>
-      <w:r>
-        <w:rPr>
-          <w:b/>
-          <w:color w:val="F00A0A"/>
-          <w:sz w:val="22"/>
-        </w:rPr>
-        <w:t xml:space="preserve">ALBERTO: </w:t>
-      </w:r>
-      <w:r>
-        <w:rPr>
-          <w:sz w:val="22"/>
-        </w:rPr>
-        <w:t>L'errore più comune che riscontriamo è un approccio simile a quello che usiamo sui motori di ricerca: inseriamo poche parole chiave e ci aspettiamo un elaborato complesso. E quando l'output è piatto o scolastico, pensiamo che lo strumento non funzioni.</w:t>
-      </w:r>
-    </w:p>
-    <w:p>
-      <w:r>
-        <w:rPr>
-          <w:b/>
-          <w:color w:val="06006B"/>
-          <w:sz w:val="22"/>
-        </w:rPr>
-        <w:t xml:space="preserve">SARA: </w:t>
-      </w:r>
-      <w:r>
-        <w:rPr>
-          <w:sz w:val="22"/>
-        </w:rPr>
-        <w:t>Pensiamo a questo input: "Crea una presentazione sull'AI". Cosa manca per renderlo una richiesta professionale?</w:t>
-      </w:r>
-    </w:p>
-    <w:p>
-      <w:r>
-        <w:rPr>
-          <w:i/>
-          <w:color w:val="555555"/>
-          <w:sz w:val="20"/>
-        </w:rPr>
-        <w:t>(raccoglie risposte dal pubblico — 1-2 min)</w:t>
-      </w:r>
-    </w:p>
-    <w:p>
-      <w:r>
-        <w:rPr>
-          <w:b/>
-          <w:color w:val="F00A0A"/>
-          <w:sz w:val="22"/>
-        </w:rPr>
-        <w:t xml:space="preserve">ALBERTO: </w:t>
-      </w:r>
-      <w:r>
-        <w:rPr>
-          <w:sz w:val="22"/>
-        </w:rPr>
-        <w:t>Manca tutto il contesto essenziale: a chi è rivolto? Che tono di voce dobbiamo usare? Qual è la lunghezza desiderata? L'AI non ha modo di indovinarlo.</w:t>
-      </w:r>
-    </w:p>
-    <w:p/>
-    <w:p>
-      <w:pPr>
-        <w:pStyle w:val="Heading3"/>
-      </w:pPr>
-      <w:r>
-        <w:rPr>
-          <w:color w:val="F00A0A"/>
-          <w:sz w:val="24"/>
-        </w:rPr>
-        <w:t>SLIDE 14 — LE REGOLE D'ORO</w:t>
+        <w:t>A) ⚙️ Un file di log di sistema | B) 🗄️ Un formato proprietario per database relazionali | C) 📝 Markdown — formato di testo puro con sintassi leggera</w:t>
       </w:r>
     </w:p>
     <w:p>
@@ -1071,77 +993,307 @@
           <w:color w:val="0055AA"/>
           <w:sz w:val="20"/>
         </w:rPr>
-        <w:t>[schermo] 5 regole: Assegna un RUOLO | Fornisci CONTESTO | Definisci il FORMATO | Dai ESEMPI | ITERA</w:t>
+        <w:t>Footer: "Approfondimento → medium.com: Why Markdown became the working language of AI"</w:t>
       </w:r>
     </w:p>
+    <w:p/>
     <w:p>
       <w:r>
-        <w:rPr>
-          <w:i/>
-          <w:color w:val="FF9900"/>
-          <w:sz w:val="20"/>
-        </w:rPr>
-        <w:t>[ Integrare con slide_ai_prompt_design p.12 + p.15-16 ]</w:t>
+        <w:t>**ALBERTO:** A proposito di Markdown, quanti di voi sanno cosa rappresenta un file con estensione ".md"?</w:t>
       </w:r>
     </w:p>
     <w:p/>
     <w:p>
       <w:r>
         <w:rPr>
-          <w:b/>
-          <w:color w:val="06006B"/>
-          <w:sz w:val="22"/>
+          <w:i/>
+          <w:color w:val="555555"/>
+          <w:sz w:val="20"/>
         </w:rPr>
-        <w:t xml:space="preserve">SARA: </w:t>
-      </w:r>
-      <w:r>
-        <w:rPr>
-          <w:sz w:val="22"/>
-        </w:rPr>
-        <w:t>Esistono cinque principi cardine per costruire un prompt solido.</w:t>
+        <w:t>*(aspetta le risposte)*</w:t>
       </w:r>
     </w:p>
+    <w:p/>
+    <w:p>
+      <w:r>
+        <w:t>**ALBERTO:** Esatto, è la C. Il Markdown è un formato di testo puro, inventato per formattare contenuti sul web usando solo caratteri standard: un cancelletto per i titoli, asterischi per il grassetto.</w:t>
+      </w:r>
+    </w:p>
+    <w:p/>
+    <w:p>
+      <w:r>
+        <w:t>**GAIA:** Essendo puramente testuale ma altamente strutturato, è il formato che i modelli AI "digeriscono" meglio. Riduce le incomprensioni e aumenta la precisione delle analisi. Vi suggeriamo di iniziare a usarlo per i brief strutturati.</w:t>
+      </w:r>
+    </w:p>
+    <w:p/>
     <w:p>
       <w:r>
         <w:rPr>
-          <w:b/>
-          <w:color w:val="F00A0A"/>
-          <w:sz w:val="22"/>
+          <w:i/>
+          <w:color w:val="555555"/>
+          <w:sz w:val="20"/>
         </w:rPr>
-        <w:t xml:space="preserve">ALBERTO: </w:t>
-      </w:r>
-      <w:r>
-        <w:rPr>
-          <w:sz w:val="22"/>
-        </w:rPr>
-        <w:t>Il primo è fondamentale: assegnare un ruolo. "Agisci come un analista di mercato senior" configura immediatamente il livello linguistico e la profondità dell'analisi.</w:t>
+        <w:t>**[slide →]**</w:t>
       </w:r>
     </w:p>
+    <w:p/>
     <w:p>
       <w:r>
         <w:rPr>
-          <w:b/>
-          <w:color w:val="06006B"/>
-          <w:sz w:val="22"/>
+          <w:color w:val="555555"/>
+          <w:sz w:val="16"/>
         </w:rPr>
-        <w:t xml:space="preserve">SARA: </w:t>
-      </w:r>
-      <w:r>
-        <w:rPr>
-          <w:sz w:val="22"/>
-        </w:rPr>
-        <w:t>L'ultimo passaggio è altrettanto cruciale: l'iterazione. L'AI non deve produrre il risultato perfetto al primo colpo; è un processo conversazionale in cui si raffina la richiesta progressivamente.</w:t>
+        <w:t>──────────────────────────────────────────────────────────────────────</w:t>
       </w:r>
     </w:p>
     <w:p/>
     <w:p>
       <w:pPr>
-        <w:pStyle w:val="Heading3"/>
+        <w:pStyle w:val="Heading2"/>
       </w:pPr>
       <w:r>
         <w:rPr>
-          <w:color w:val="F00A0A"/>
-          <w:sz w:val="24"/>
+          <w:color w:val="06006B"/>
+          <w:sz w:val="30"/>
+        </w:rPr>
+        <w:t>SLIDE 12 — SEZIONE 03: PROMPT OPTIMIZATION</w:t>
+      </w:r>
+    </w:p>
+    <w:p>
+      <w:pPr>
+        <w:ind w:left="432"/>
+      </w:pPr>
+      <w:r>
+        <w:rPr>
+          <w:color w:val="0055AA"/>
+          <w:sz w:val="20"/>
+        </w:rPr>
+        <w:t>[schermo] Intestazione sezione: "03 — Prompt Optimization"</w:t>
+      </w:r>
+    </w:p>
+    <w:p>
+      <w:pPr>
+        <w:ind w:left="432"/>
+      </w:pPr>
+      <w:r>
+        <w:rPr>
+          <w:color w:val="0055AA"/>
+          <w:sz w:val="20"/>
+        </w:rPr>
+        <w:t>Sottotitolo: "Principi per comunicare efficacemente con i modelli generativi"</w:t>
+      </w:r>
+    </w:p>
+    <w:p/>
+    <w:p>
+      <w:r>
+        <w:rPr>
+          <w:i/>
+          <w:color w:val="555555"/>
+          <w:sz w:val="20"/>
+        </w:rPr>
+        <w:t>**[slide →]**</w:t>
+      </w:r>
+    </w:p>
+    <w:p/>
+    <w:p>
+      <w:r>
+        <w:rPr>
+          <w:color w:val="555555"/>
+          <w:sz w:val="16"/>
+        </w:rPr>
+        <w:t>──────────────────────────────────────────────────────────────────────</w:t>
+      </w:r>
+    </w:p>
+    <w:p/>
+    <w:p>
+      <w:pPr>
+        <w:pStyle w:val="Heading2"/>
+      </w:pPr>
+      <w:r>
+        <w:rPr>
+          <w:color w:val="06006B"/>
+          <w:sz w:val="30"/>
+        </w:rPr>
+        <w:t>SLIDE 13 — IL PROMPT INEFFICACE</w:t>
+      </w:r>
+    </w:p>
+    <w:p>
+      <w:pPr>
+        <w:ind w:left="432"/>
+      </w:pPr>
+      <w:r>
+        <w:rPr>
+          <w:color w:val="0055AA"/>
+          <w:sz w:val="20"/>
+        </w:rPr>
+        <w:t>[schermo] Riquadro rosso con prompt: "Crea una presentazione sull'AI"</w:t>
+      </w:r>
+    </w:p>
+    <w:p>
+      <w:pPr>
+        <w:ind w:left="432"/>
+      </w:pPr>
+      <w:r>
+        <w:rPr>
+          <w:color w:val="0055AA"/>
+          <w:sz w:val="20"/>
+        </w:rPr>
+        <w:t>Freccia → Output: generico, scolastico</w:t>
+      </w:r>
+    </w:p>
+    <w:p>
+      <w:pPr>
+        <w:ind w:left="432"/>
+      </w:pPr>
+      <w:r>
+        <w:rPr>
+          <w:color w:val="0055AA"/>
+          <w:sz w:val="20"/>
+        </w:rPr>
+        <w:t>Sotto: 4 bullet con i contesti mancanti</w:t>
+      </w:r>
+    </w:p>
+    <w:p/>
+    <w:p>
+      <w:r>
+        <w:t>**SARA:** Arriviamo alla tecnica: il Prompt Engineering.</w:t>
+      </w:r>
+    </w:p>
+    <w:p/>
+    <w:p>
+      <w:r>
+        <w:t>**ALBERTO:** L'errore più comune che riscontriamo è un approccio simile a quello che usiamo sui motori di ricerca: inseriamo poche parole chiave e ci aspettiamo un elaborato complesso. E quando l'output è piatto o scolastico, pensiamo che lo strumento non funzioni.</w:t>
+      </w:r>
+    </w:p>
+    <w:p/>
+    <w:p>
+      <w:r>
+        <w:t>**SARA:** Pensiamo a questo input: `"Crea una presentazione sull'AI"`. Cosa manca per renderlo una richiesta professionale?</w:t>
+      </w:r>
+    </w:p>
+    <w:p/>
+    <w:p>
+      <w:r>
+        <w:rPr>
+          <w:i/>
+          <w:color w:val="555555"/>
+          <w:sz w:val="20"/>
+        </w:rPr>
+        <w:t>*(raccoglie risposte dal pubblico)*</w:t>
+      </w:r>
+    </w:p>
+    <w:p/>
+    <w:p>
+      <w:r>
+        <w:t>**ALBERTO:** Manca tutto il contesto essenziale: a chi è rivolto? Che tono di voce dobbiamo usare? Qual è la lunghezza desiderata? L'AI non ha modo di indovinarlo.</w:t>
+      </w:r>
+    </w:p>
+    <w:p/>
+    <w:p>
+      <w:r>
+        <w:rPr>
+          <w:i/>
+          <w:color w:val="555555"/>
+          <w:sz w:val="20"/>
+        </w:rPr>
+        <w:t>**[slide →]**</w:t>
+      </w:r>
+    </w:p>
+    <w:p/>
+    <w:p>
+      <w:r>
+        <w:rPr>
+          <w:color w:val="555555"/>
+          <w:sz w:val="16"/>
+        </w:rPr>
+        <w:t>──────────────────────────────────────────────────────────────────────</w:t>
+      </w:r>
+    </w:p>
+    <w:p/>
+    <w:p>
+      <w:pPr>
+        <w:pStyle w:val="Heading2"/>
+      </w:pPr>
+      <w:r>
+        <w:rPr>
+          <w:color w:val="06006B"/>
+          <w:sz w:val="30"/>
+        </w:rPr>
+        <w:t>SLIDE 14 — LE REGOLE D'ORO E IL MINDSET</w:t>
+      </w:r>
+    </w:p>
+    <w:p>
+      <w:pPr>
+        <w:ind w:left="432"/>
+      </w:pPr>
+      <w:r>
+        <w:rPr>
+          <w:color w:val="0055AA"/>
+          <w:sz w:val="20"/>
+        </w:rPr>
+        <w:t>[schermo] 6 regole per il Prompt Design:</w:t>
+      </w:r>
+    </w:p>
+    <w:p>
+      <w:pPr>
+        <w:ind w:left="432"/>
+      </w:pPr>
+      <w:r>
+        <w:rPr>
+          <w:color w:val="0055AA"/>
+          <w:sz w:val="20"/>
+        </w:rPr>
+        <w:t>1. Definisci l'obiettivo | 2. Itera e raffina | 3. Usa l'AI come copilota | 4. Adotta un mindset innovativo | 5. Valuta i risultati | 6. Mantieni flessibilità</w:t>
+      </w:r>
+    </w:p>
+    <w:p/>
+    <w:p>
+      <w:r>
+        <w:t>**SARA:** Un agente AI è un sistema autonomo capace di percepire l'ambiente, pianificare e prendere decisioni. Per guidarlo serve un approccio consapevole.</w:t>
+      </w:r>
+    </w:p>
+    <w:p/>
+    <w:p>
+      <w:r>
+        <w:t>**ALBERTO:** Esistono regole fondamentali: definire chiaramente l'obiettivo, assegnando contesto e dettagli; usare l'AI come un "copilota" e non come un sostituto; e soprattutto adottare una mentalità innovativa, evitando di replicare ciecamente processi tradizionali.</w:t>
+      </w:r>
+    </w:p>
+    <w:p/>
+    <w:p>
+      <w:r>
+        <w:t>**SARA:** E infine, l'iterazione e la verifica. I modelli generativi non sono deterministici: è fondamentale valutare sempre se i risultati contengono bias o inesattezze e raffinare progressivamente la richiesta.</w:t>
+      </w:r>
+    </w:p>
+    <w:p/>
+    <w:p>
+      <w:r>
+        <w:rPr>
+          <w:i/>
+          <w:color w:val="555555"/>
+          <w:sz w:val="20"/>
+        </w:rPr>
+        <w:t>**[slide →]**</w:t>
+      </w:r>
+    </w:p>
+    <w:p/>
+    <w:p>
+      <w:r>
+        <w:rPr>
+          <w:color w:val="555555"/>
+          <w:sz w:val="16"/>
+        </w:rPr>
+        <w:t>──────────────────────────────────────────────────────────────────────</w:t>
+      </w:r>
+    </w:p>
+    <w:p/>
+    <w:p>
+      <w:pPr>
+        <w:pStyle w:val="Heading2"/>
+      </w:pPr>
+      <w:r>
+        <w:rPr>
+          <w:color w:val="06006B"/>
+          <w:sz w:val="30"/>
         </w:rPr>
         <w:t>SLIDE 15 — PRIMA / DOPO</w:t>
       </w:r>
@@ -1155,36 +1307,64 @@
           <w:color w:val="0055AA"/>
           <w:sz w:val="20"/>
         </w:rPr>
-        <w:t>[schermo] ❌ "Scrivi un'email di aggiornamento al cliente" → output generico. ✅ Prompt strutturato con Ruolo, Contesto, Obiettivo, Formato e Vincoli</w:t>
+        <w:t>[schermo] Quattro tipi di prompt:</w:t>
       </w:r>
     </w:p>
     <w:p>
+      <w:pPr>
+        <w:ind w:left="432"/>
+      </w:pPr>
       <w:r>
         <w:rPr>
-          <w:i/>
-          <w:color w:val="FF9900"/>
+          <w:color w:val="0055AA"/>
           <w:sz w:val="20"/>
         </w:rPr>
-        <w:t>[ Esempio pratico da slide_ai_prompt_design p.18 ]</w:t>
+        <w:t>1. Informativi (per risposte e sintesi)</w:t>
+      </w:r>
+    </w:p>
+    <w:p>
+      <w:pPr>
+        <w:ind w:left="432"/>
+      </w:pPr>
+      <w:r>
+        <w:rPr>
+          <w:color w:val="0055AA"/>
+          <w:sz w:val="20"/>
+        </w:rPr>
+        <w:t>2. Generativi (per idee creative e narrazioni)</w:t>
+      </w:r>
+    </w:p>
+    <w:p>
+      <w:pPr>
+        <w:ind w:left="432"/>
+      </w:pPr>
+      <w:r>
+        <w:rPr>
+          <w:color w:val="0055AA"/>
+          <w:sz w:val="20"/>
+        </w:rPr>
+        <w:t>3. Analitici (per liste e tabelle)</w:t>
+      </w:r>
+    </w:p>
+    <w:p>
+      <w:pPr>
+        <w:ind w:left="432"/>
+      </w:pPr>
+      <w:r>
+        <w:rPr>
+          <w:color w:val="0055AA"/>
+          <w:sz w:val="20"/>
+        </w:rPr>
+        <w:t>4. Role-Based (assegnare un ruolo per risultati contestuali)</w:t>
       </w:r>
     </w:p>
     <w:p/>
     <w:p>
       <w:r>
-        <w:rPr>
-          <w:b/>
-          <w:color w:val="880088"/>
-          <w:sz w:val="22"/>
-        </w:rPr>
-        <w:t xml:space="preserve">CATERINA: </w:t>
-      </w:r>
-      <w:r>
-        <w:rPr>
-          <w:sz w:val="22"/>
-        </w:rPr>
-        <w:t>Vediamo un confronto applicato a un caso d'uso quotidiano.</w:t>
+        <w:t>**CATERINA:** Vediamo un confronto applicato ai nostri flussi quotidiani. Possiamo variare tipologia: dai prompt informativi a quelli analitici, fino a quelli basati sui ruoli, come "Agisci come un cliente altospendente".</w:t>
       </w:r>
     </w:p>
+    <w:p/>
     <w:p>
       <w:r>
         <w:rPr>
@@ -1192,84 +1372,103 @@
           <w:color w:val="555555"/>
           <w:sz w:val="20"/>
         </w:rPr>
-        <w:t>(pausa — il pubblico legge i due prompt)</w:t>
-      </w:r>
-    </w:p>
-    <w:p>
-      <w:r>
-        <w:rPr>
-          <w:b/>
-          <w:color w:val="008844"/>
-          <w:sz w:val="22"/>
-        </w:rPr>
-        <w:t xml:space="preserve">GAIA: </w:t>
-      </w:r>
-      <w:r>
-        <w:rPr>
-          <w:sz w:val="22"/>
-        </w:rPr>
-        <w:t>Investire due minuti per strutturare bene la richiesta vi restituisce un testo che richiederà solo minimi aggiustamenti, anziché doverlo riscrivere da capo.</w:t>
+        <w:t>*(pausa — il pubblico osserva lo schema)*</w:t>
       </w:r>
     </w:p>
     <w:p/>
     <w:p>
-      <w:pPr>
-        <w:pStyle w:val="Heading3"/>
-      </w:pPr>
       <w:r>
-        <w:rPr>
-          <w:color w:val="F00A0A"/>
-          <w:sz w:val="24"/>
-        </w:rPr>
-        <w:t>SLIDE 16 — STRUTTURE AVANZATE</w:t>
-      </w:r>
-    </w:p>
-    <w:p>
-      <w:r>
-        <w:rPr>
-          <w:i/>
-          <w:color w:val="FF9900"/>
-          <w:sz w:val="20"/>
-        </w:rPr>
-        <w:t>[ Contenuto da slide_ai_prompt_design p.20-21-22 riformulato in chiave accessibile ]</w:t>
+        <w:t>**GAIA:** Investire due minuti per strutturare bene la richiesta vi restituisce un testo che richiederà solo minimi aggiustamenti, anziché doverlo riscrivere da capo.</w:t>
       </w:r>
     </w:p>
     <w:p/>
     <w:p>
       <w:r>
         <w:rPr>
-          <w:b/>
-          <w:color w:val="06006B"/>
-          <w:sz w:val="22"/>
+          <w:i/>
+          <w:color w:val="555555"/>
+          <w:sz w:val="20"/>
         </w:rPr>
-        <w:t xml:space="preserve">SARA: </w:t>
-      </w:r>
-      <w:r>
-        <w:rPr>
-          <w:sz w:val="22"/>
-        </w:rPr>
-        <w:t>Quando le attività diventano più complesse, possiamo usare tecniche avanzate per guidare il ragionamento della macchina.</w:t>
+        <w:t>**[slide →]**</w:t>
       </w:r>
     </w:p>
+    <w:p/>
     <w:p>
       <w:r>
         <w:rPr>
-          <w:i/>
-          <w:color w:val="FF9900"/>
-          <w:sz w:val="20"/>
+          <w:color w:val="555555"/>
+          <w:sz w:val="16"/>
         </w:rPr>
-        <w:t>[ Script da costruire dopo lettura PDF p.20-21-22 ]</w:t>
+        <w:t>──────────────────────────────────────────────────────────────────────</w:t>
       </w:r>
     </w:p>
     <w:p/>
     <w:p>
       <w:pPr>
-        <w:pStyle w:val="Heading3"/>
+        <w:pStyle w:val="Heading2"/>
       </w:pPr>
       <w:r>
         <w:rPr>
-          <w:color w:val="F00A0A"/>
-          <w:sz w:val="24"/>
+          <w:color w:val="06006B"/>
+          <w:sz w:val="30"/>
+        </w:rPr>
+        <w:t>SLIDE 16 — STRUTTURE AVANZATE</w:t>
+      </w:r>
+    </w:p>
+    <w:p>
+      <w:pPr>
+        <w:ind w:left="432"/>
+      </w:pPr>
+      <w:r>
+        <w:rPr>
+          <w:color w:val="0055AA"/>
+          <w:sz w:val="20"/>
+        </w:rPr>
+        <w:t>[schermo] Regole avanzate: Usa frasi affermative | Metti in evidenza i punti chiave | Usa i vincoli (constraints) | Chiedi all'AI di farti domande (reverse prompting) | Chiedi opzioni multiple | Usa il Few-shot learning</w:t>
+      </w:r>
+    </w:p>
+    <w:p/>
+    <w:p>
+      <w:r>
+        <w:t>**SARA:** Quando le attività diventano più complesse, possiamo usare tecniche avanzate per guidare il ragionamento della macchina.</w:t>
+      </w:r>
+    </w:p>
+    <w:p/>
+    <w:p>
+      <w:r>
+        <w:t>**ALBERTO:** Invece di descrivere solo il compito, possiamo fornire esempi reali di input e output (few-shot learning) o imporre vincoli precisi. È anche molto utile chiedere all'AI di farci delle domande prima di rispondere, se mancano dettagli fondamentali.</w:t>
+      </w:r>
+    </w:p>
+    <w:p/>
+    <w:p>
+      <w:r>
+        <w:rPr>
+          <w:i/>
+          <w:color w:val="555555"/>
+          <w:sz w:val="20"/>
+        </w:rPr>
+        <w:t>**[slide →]**</w:t>
+      </w:r>
+    </w:p>
+    <w:p/>
+    <w:p>
+      <w:r>
+        <w:rPr>
+          <w:color w:val="555555"/>
+          <w:sz w:val="16"/>
+        </w:rPr>
+        <w:t>──────────────────────────────────────────────────────────────────────</w:t>
+      </w:r>
+    </w:p>
+    <w:p/>
+    <w:p>
+      <w:pPr>
+        <w:pStyle w:val="Heading2"/>
+      </w:pPr>
+      <w:r>
+        <w:rPr>
+          <w:color w:val="06006B"/>
+          <w:sz w:val="30"/>
         </w:rPr>
         <w:t>SLIDE 17 — TOOL DI OTTIMIZZAZIONE: CAVEMAN</w:t>
       </w:r>
@@ -1283,92 +1482,7 @@
           <w:color w:val="0055AA"/>
           <w:sz w:val="20"/>
         </w:rPr>
-        <w:t>[schermo] "Ottimizzazione dei token" — github.com/JuliusBrussee/caveman — compressione testo per AI</w:t>
-      </w:r>
-    </w:p>
-    <w:p/>
-    <w:p>
-      <w:r>
-        <w:rPr>
-          <w:b/>
-          <w:color w:val="880088"/>
-          <w:sz w:val="22"/>
-        </w:rPr>
-        <w:t xml:space="preserve">CATERINA: </w:t>
-      </w:r>
-      <w:r>
-        <w:rPr>
-          <w:sz w:val="22"/>
-        </w:rPr>
-        <w:t>Un breve inciso per chi vuole spingersi oltre. Esistono strumenti pensati per ottimizzare il modo in cui forniamo grandi moli di testo all'AI. Un esempio è Caveman, un progetto open source.</w:t>
-      </w:r>
-    </w:p>
-    <w:p>
-      <w:r>
-        <w:rPr>
-          <w:b/>
-          <w:color w:val="F00A0A"/>
-          <w:sz w:val="22"/>
-        </w:rPr>
-        <w:t xml:space="preserve">ALBERTO: </w:t>
-      </w:r>
-      <w:r>
-        <w:rPr>
-          <w:sz w:val="22"/>
-        </w:rPr>
-        <w:t>L'idea è ridurre il testo rimuovendo tutto ciò che non è semanticamente essenziale per la macchina, risparmiando spazio (i cosiddetti "token") e costi, senza compromettere la comprensione da parte del modello.</w:t>
-      </w:r>
-    </w:p>
-    <w:p>
-      <w:r>
-        <w:rPr>
-          <w:b/>
-          <w:color w:val="880088"/>
-          <w:sz w:val="22"/>
-        </w:rPr>
-        <w:t xml:space="preserve">CATERINA: </w:t>
-      </w:r>
-      <w:r>
-        <w:rPr>
-          <w:sz w:val="22"/>
-        </w:rPr>
-        <w:t>È uno strumento utile specialmente quando si iniziano a usare flussi automatizzati complessi. Ne approfondiremo l'impiego nella prossima sessione.</w:t>
-      </w:r>
-    </w:p>
-    <w:p/>
-    <w:p>
-      <w:pPr>
-        <w:pStyle w:val="Heading3"/>
-      </w:pPr>
-      <w:r>
-        <w:rPr>
-          <w:color w:val="F00A0A"/>
-          <w:sz w:val="24"/>
-        </w:rPr>
-        <w:t>SLIDE 18 — SEZIONE 04: GENERAZIONI INCLUSIVE &amp; ETICA</w:t>
-      </w:r>
-    </w:p>
-    <w:p>
-      <w:r>
-        <w:rPr>
-          <w:i/>
-          <w:color w:val="555555"/>
-          <w:sz w:val="20"/>
-        </w:rPr>
-        <w:t>(cambio di sezione)</w:t>
-      </w:r>
-    </w:p>
-    <w:p/>
-    <w:p>
-      <w:pPr>
-        <w:pStyle w:val="Heading3"/>
-      </w:pPr>
-      <w:r>
-        <w:rPr>
-          <w:color w:val="F00A0A"/>
-          <w:sz w:val="24"/>
-        </w:rPr>
-        <w:t>SLIDE 19 — L'AI NON È NEUTRALE</w:t>
+        <w:t>[schermo] "Ottimizzazione dei token"</w:t>
       </w:r>
     </w:p>
     <w:p>
@@ -1380,77 +1494,221 @@
           <w:color w:val="0055AA"/>
           <w:sz w:val="20"/>
         </w:rPr>
-        <w:t>[schermo] Testo: "I modelli riflettono i dati umani, inclusi stereotipi e pregiudizi storici." + callout "L'impatto dei bias sui risultati"</w:t>
+        <w:t>Tool: Caveman — github.com/JuliusBrussee/caveman</w:t>
       </w:r>
     </w:p>
     <w:p>
+      <w:pPr>
+        <w:ind w:left="432"/>
+      </w:pPr>
       <w:r>
         <w:rPr>
-          <w:i/>
-          <w:color w:val="FF9900"/>
+          <w:color w:val="0055AA"/>
           <w:sz w:val="20"/>
         </w:rPr>
-        <w:t>[ Schema bias da slide_ai_inclusivity p.9 + contenuto p.23-24-25 da slide_ai_prompt_design ]</w:t>
+        <w:t>4 bullet: tool open source / compressione testo per AI / utile per contesti lunghi e agenti</w:t>
+      </w:r>
+    </w:p>
+    <w:p/>
+    <w:p>
+      <w:r>
+        <w:t>**CATERINA:** Un breve inciso per chi vuole spingersi oltre. Esistono strumenti pensati per ottimizzare il modo in cui forniamo grandi moli di testo all'AI. Un esempio è Caveman, un progetto open source.</w:t>
+      </w:r>
+    </w:p>
+    <w:p/>
+    <w:p>
+      <w:r>
+        <w:t>**ALBERTO:** L'idea è ridurre il testo rimuovendo tutto ciò che non è semanticamente essenziale per la macchina, risparmiando spazio (i cosiddetti "token") e costi, senza compromettere la comprensione da parte del modello.</w:t>
+      </w:r>
+    </w:p>
+    <w:p/>
+    <w:p>
+      <w:r>
+        <w:t>**CATERINA:** È uno strumento utile specialmente quando si iniziano a usare flussi automatizzati complessi. Ne approfondiremo l'impiego nella prossima sessione.</w:t>
       </w:r>
     </w:p>
     <w:p/>
     <w:p>
       <w:r>
         <w:rPr>
-          <w:b/>
-          <w:color w:val="008844"/>
-          <w:sz w:val="22"/>
+          <w:i/>
+          <w:color w:val="555555"/>
+          <w:sz w:val="20"/>
         </w:rPr>
-        <w:t xml:space="preserve">GAIA: </w:t>
-      </w:r>
-      <w:r>
-        <w:rPr>
-          <w:sz w:val="22"/>
-        </w:rPr>
-        <w:t>Chiudiamo con un aspetto di estrema rilevanza professionale ed etica: la presunta "neutralità" della tecnologia.</w:t>
+        <w:t>**[slide →]**</w:t>
       </w:r>
     </w:p>
+    <w:p/>
     <w:p>
       <w:r>
         <w:rPr>
-          <w:b/>
-          <w:color w:val="880088"/>
-          <w:sz w:val="22"/>
+          <w:color w:val="555555"/>
+          <w:sz w:val="16"/>
         </w:rPr>
-        <w:t xml:space="preserve">CATERINA: </w:t>
-      </w:r>
-      <w:r>
-        <w:rPr>
-          <w:sz w:val="22"/>
-        </w:rPr>
-        <w:t>I modelli AI sono stati addestrati su una fotografia del mondo reale, che contiene inevitabilmente pregiudizi, stereotipi storici e squilibri. Di default, la macchina tenderà a riproporli.</w:t>
-      </w:r>
-    </w:p>
-    <w:p>
-      <w:r>
-        <w:rPr>
-          <w:b/>
-          <w:color w:val="880088"/>
-          <w:sz w:val="22"/>
-        </w:rPr>
-        <w:t xml:space="preserve">CATERINA: </w:t>
-      </w:r>
-      <w:r>
-        <w:rPr>
-          <w:sz w:val="22"/>
-        </w:rPr>
-        <w:t>Nel nostro lavoro, produrre output stereotipati significa fallire in termini di qualità e inclusività. Abbiamo la responsabilità di guidare la macchina con prompt espliciti.</w:t>
+        <w:t>──────────────────────────────────────────────────────────────────────</w:t>
       </w:r>
     </w:p>
     <w:p/>
     <w:p>
       <w:pPr>
-        <w:pStyle w:val="Heading3"/>
+        <w:pStyle w:val="Heading2"/>
       </w:pPr>
       <w:r>
         <w:rPr>
-          <w:color w:val="F00A0A"/>
-          <w:sz w:val="24"/>
+          <w:color w:val="06006B"/>
+          <w:sz w:val="30"/>
+        </w:rPr>
+        <w:t>SLIDE 18 — SEZIONE 04: GENERAZIONI INCLUSIVE &amp; ETICA</w:t>
+      </w:r>
+    </w:p>
+    <w:p>
+      <w:pPr>
+        <w:ind w:left="432"/>
+      </w:pPr>
+      <w:r>
+        <w:rPr>
+          <w:color w:val="0055AA"/>
+          <w:sz w:val="20"/>
+        </w:rPr>
+        <w:t>[schermo] Intestazione sezione: "04 — Generazioni Inclusive &amp; Etica"</w:t>
+      </w:r>
+    </w:p>
+    <w:p>
+      <w:pPr>
+        <w:ind w:left="432"/>
+      </w:pPr>
+      <w:r>
+        <w:rPr>
+          <w:color w:val="0055AA"/>
+          <w:sz w:val="20"/>
+        </w:rPr>
+        <w:t>Sottotitolo: "Mitigare i bias e guidare le generazioni in modo responsabile"</w:t>
+      </w:r>
+    </w:p>
+    <w:p/>
+    <w:p>
+      <w:r>
+        <w:rPr>
+          <w:i/>
+          <w:color w:val="555555"/>
+          <w:sz w:val="20"/>
+        </w:rPr>
+        <w:t>**[slide →]**</w:t>
+      </w:r>
+    </w:p>
+    <w:p/>
+    <w:p>
+      <w:r>
+        <w:rPr>
+          <w:color w:val="555555"/>
+          <w:sz w:val="16"/>
+        </w:rPr>
+        <w:t>──────────────────────────────────────────────────────────────────────</w:t>
+      </w:r>
+    </w:p>
+    <w:p/>
+    <w:p>
+      <w:pPr>
+        <w:pStyle w:val="Heading2"/>
+      </w:pPr>
+      <w:r>
+        <w:rPr>
+          <w:color w:val="06006B"/>
+          <w:sz w:val="30"/>
+        </w:rPr>
+        <w:t>SLIDE 19 — L'AI NON È NEUTRALE E L'INCLUSIVE DESIGN</w:t>
+      </w:r>
+    </w:p>
+    <w:p>
+      <w:pPr>
+        <w:ind w:left="432"/>
+      </w:pPr>
+      <w:r>
+        <w:rPr>
+          <w:color w:val="0055AA"/>
+          <w:sz w:val="20"/>
+        </w:rPr>
+        <w:t>[schermo] Due colonne:</w:t>
+      </w:r>
+    </w:p>
+    <w:p>
+      <w:pPr>
+        <w:ind w:left="432"/>
+      </w:pPr>
+      <w:r>
+        <w:rPr>
+          <w:color w:val="0055AA"/>
+          <w:sz w:val="20"/>
+        </w:rPr>
+        <w:t>Sinistra: testo — "L'Inclusive Design non significa progettare una sola cosa per tutte le persone. Significa progettare una varietà di modalità di partecipazione."</w:t>
+      </w:r>
+    </w:p>
+    <w:p>
+      <w:pPr>
+        <w:ind w:left="432"/>
+      </w:pPr>
+      <w:r>
+        <w:rPr>
+          <w:color w:val="0055AA"/>
+          <w:sz w:val="20"/>
+        </w:rPr>
+        <w:t>Destra: Callout "L'impatto dei bias sui risultati aziendali e comunicativi e l'uso di Prompt Strutturati (Medium + Subject + Details + Parameters)"</w:t>
+      </w:r>
+    </w:p>
+    <w:p/>
+    <w:p>
+      <w:r>
+        <w:t>**GAIA:** Chiudiamo con un aspetto di estrema rilevanza professionale ed etica: la presunta "neutralità" della tecnologia.</w:t>
+      </w:r>
+    </w:p>
+    <w:p/>
+    <w:p>
+      <w:r>
+        <w:t>**CATERINA:** I modelli AI sono stati addestrati su una fotografia del mondo reale, che contiene inevitabilmente pregiudizi, stereotipi storici e squilibri. Di default, la macchina tenderà a riproporli. L'Inclusive Design non impone un'unica soluzione, ma abbraccia molteplici varianti affinché tutti si sentano parte integrante.</w:t>
+      </w:r>
+    </w:p>
+    <w:p/>
+    <w:p>
+      <w:r>
+        <w:t>**GAIA:** Quando generiamo immagini, per esempio, se non specifichiamo i dettagli l'AI ricadrà nei suoi bias di base. È vitale strutturare i prompt visivi specificando il Mezzo, il Soggetto, i Dettagli e i Parametri, utilizzando descrittori inclusivi per età, genere ed etnia per rappresentare la bellezza reale e diversificata.</w:t>
+      </w:r>
+    </w:p>
+    <w:p/>
+    <w:p>
+      <w:r>
+        <w:t>**CATERINA:** Nel nostro lavoro, produrre output stereotipati significa fallire in termini di qualità e inclusività. Abbiamo la responsabilità di guidare la macchina con prompt espliciti.</w:t>
+      </w:r>
+    </w:p>
+    <w:p/>
+    <w:p>
+      <w:r>
+        <w:rPr>
+          <w:i/>
+          <w:color w:val="555555"/>
+          <w:sz w:val="20"/>
+        </w:rPr>
+        <w:t>**[slide →]**</w:t>
+      </w:r>
+    </w:p>
+    <w:p/>
+    <w:p>
+      <w:r>
+        <w:rPr>
+          <w:color w:val="555555"/>
+          <w:sz w:val="16"/>
+        </w:rPr>
+        <w:t>──────────────────────────────────────────────────────────────────────</w:t>
+      </w:r>
+    </w:p>
+    <w:p/>
+    <w:p>
+      <w:pPr>
+        <w:pStyle w:val="Heading2"/>
+      </w:pPr>
+      <w:r>
+        <w:rPr>
+          <w:color w:val="06006B"/>
+          <w:sz w:val="30"/>
         </w:rPr>
         <w:t>SLIDE 20 — VIDEO: PASOLINI / UNGARETTI</w:t>
       </w:r>
@@ -1464,26 +1722,28 @@
           <w:color w:val="0055AA"/>
           <w:sz w:val="20"/>
         </w:rPr>
-        <w:t>[schermo] YouTube: https://www.youtube.com/watch?v=A5-kvHUcJw8  |  1964 — Pier Paolo Pasolini, Comizi d'Amore  |  Durata: ~2 min</w:t>
+        <w:t>[schermo] Player YouTube embed — https://www.youtube.com/watch?v=A5-kvHUcJw8</w:t>
+      </w:r>
+    </w:p>
+    <w:p>
+      <w:pPr>
+        <w:ind w:left="432"/>
+      </w:pPr>
+      <w:r>
+        <w:rPr>
+          <w:color w:val="0055AA"/>
+          <w:sz w:val="20"/>
+        </w:rPr>
+        <w:t>"1964 — Pier Paolo Pasolini, Comizi d'Amore" | Durata clip: ~2 min</w:t>
       </w:r>
     </w:p>
     <w:p/>
     <w:p>
       <w:r>
-        <w:rPr>
-          <w:b/>
-          <w:color w:val="06006B"/>
-          <w:sz w:val="22"/>
-        </w:rPr>
-        <w:t xml:space="preserve">SARA: </w:t>
-      </w:r>
-      <w:r>
-        <w:rPr>
-          <w:sz w:val="22"/>
-        </w:rPr>
-        <w:t>Per fissare questo concetto, vorremmo mostrarvi un breve frammento storico. È il 1964, e Pier Paolo Pasolini indaga l'opinione degli italiani in "Comizi d'Amore".</w:t>
+        <w:t>**SARA:** Per fissare questo concetto, vorremmo mostrarvi un breve frammento storico. È il 1964, e Pier Paolo Pasolini indaga l'opinione degli italiani in "Comizi d'Amore".</w:t>
       </w:r>
     </w:p>
+    <w:p/>
     <w:p>
       <w:r>
         <w:rPr>
@@ -1491,49 +1751,10 @@
           <w:color w:val="555555"/>
           <w:sz w:val="20"/>
         </w:rPr>
-        <w:t>(si avvia il video — 2 min)</w:t>
+        <w:t>*(si avvia il video)*</w:t>
       </w:r>
     </w:p>
     <w:p/>
-    <w:p>
-      <w:pPr>
-        <w:pStyle w:val="Heading3"/>
-      </w:pPr>
-      <w:r>
-        <w:rPr>
-          <w:color w:val="F00A0A"/>
-          <w:sz w:val="24"/>
-        </w:rPr>
-        <w:t>SLIDE 21 — DOPO IL VIDEO: RIFLESSIONE</w:t>
-      </w:r>
-    </w:p>
-    <w:p>
-      <w:r>
-        <w:rPr>
-          <w:i/>
-          <w:color w:val="FF9900"/>
-          <w:sz w:val="20"/>
-        </w:rPr>
-        <w:t>[ Contenuto da slide_ai_inclusivity p.11-12-14 ]</w:t>
-      </w:r>
-    </w:p>
-    <w:p/>
-    <w:p>
-      <w:r>
-        <w:rPr>
-          <w:b/>
-          <w:color w:val="008844"/>
-          <w:sz w:val="22"/>
-        </w:rPr>
-        <w:t xml:space="preserve">GAIA: </w:t>
-      </w:r>
-      <w:r>
-        <w:rPr>
-          <w:sz w:val="22"/>
-        </w:rPr>
-        <w:t>Notate come la selezione degli intervistati e la formulazione delle domande influenzino profondamente il quadro che emerge?</w:t>
-      </w:r>
-    </w:p>
     <w:p>
       <w:r>
         <w:rPr>
@@ -1541,39 +1762,18 @@
           <w:color w:val="555555"/>
           <w:sz w:val="20"/>
         </w:rPr>
-        <w:t>(breve scambio con il pubblico — 1-2 min)</w:t>
+        <w:t>**[VIDEO — 2 min]**</w:t>
       </w:r>
     </w:p>
+    <w:p/>
     <w:p>
       <w:r>
         <w:rPr>
-          <w:b/>
-          <w:color w:val="880088"/>
-          <w:sz w:val="22"/>
+          <w:i/>
+          <w:color w:val="555555"/>
+          <w:sz w:val="20"/>
         </w:rPr>
-        <w:t xml:space="preserve">CATERINA: </w:t>
-      </w:r>
-      <w:r>
-        <w:rPr>
-          <w:sz w:val="22"/>
-        </w:rPr>
-        <w:t>Se chiedessimo oggi a un'AI di sintetizzare l'opinione pubblica su temi complessi, il rischio è ottenere la voce della "maggioranza statistica" presente nei suoi dati di addestramento, silenziando altre prospettive.</w:t>
-      </w:r>
-    </w:p>
-    <w:p>
-      <w:r>
-        <w:rPr>
-          <w:b/>
-          <w:color w:val="F00A0A"/>
-          <w:sz w:val="22"/>
-        </w:rPr>
-        <w:t xml:space="preserve">ALBERTO: </w:t>
-      </w:r>
-      <w:r>
-        <w:rPr>
-          <w:sz w:val="22"/>
-        </w:rPr>
-        <w:t>Esserne consapevoli ci permette di inserire vincoli precisi nei nostri prompt per ottenere risultati bilanciati e professionali.</w:t>
+        <w:t>**[slide →]**</w:t>
       </w:r>
     </w:p>
     <w:p/>
@@ -1586,6 +1786,7 @@
         <w:t>──────────────────────────────────────────────────────────────────────</w:t>
       </w:r>
     </w:p>
+    <w:p/>
     <w:p>
       <w:pPr>
         <w:pStyle w:val="Heading2"/>
@@ -1595,9 +1796,90 @@
           <w:color w:val="06006B"/>
           <w:sz w:val="30"/>
         </w:rPr>
-        <w:t>PARTE 2 — ESERCITAZIONE PRATICA (10 min)</w:t>
+        <w:t>SLIDE 21 — DOPO IL VIDEO: RIFLESSIONE</w:t>
       </w:r>
     </w:p>
+    <w:p>
+      <w:pPr>
+        <w:ind w:left="432"/>
+      </w:pPr>
+      <w:r>
+        <w:rPr>
+          <w:color w:val="0055AA"/>
+          <w:sz w:val="20"/>
+        </w:rPr>
+        <w:t>[schermo] "Riflessione sui campioni di dati: Soddisfare le esigenze reali, non solo il maggior numero di utenti"</w:t>
+      </w:r>
+    </w:p>
+    <w:p>
+      <w:pPr>
+        <w:ind w:left="432"/>
+      </w:pPr>
+      <w:r>
+        <w:rPr>
+          <w:color w:val="0055AA"/>
+          <w:sz w:val="20"/>
+        </w:rPr>
+        <w:t>"Diversità Interne ed Esterne: Genere, Abilità, Età, Cultura, Reddito, Istruzione"</w:t>
+      </w:r>
+    </w:p>
+    <w:p/>
+    <w:p>
+      <w:r>
+        <w:t>**GAIA:** Notate come la selezione degli intervistati e la formulazione delle domande influenzino profondamente il quadro che emerge?</w:t>
+      </w:r>
+    </w:p>
+    <w:p/>
+    <w:p>
+      <w:r>
+        <w:rPr>
+          <w:i/>
+          <w:color w:val="555555"/>
+          <w:sz w:val="20"/>
+        </w:rPr>
+        <w:t>*(breve scambio con il pubblico)*</w:t>
+      </w:r>
+    </w:p>
+    <w:p/>
+    <w:p>
+      <w:r>
+        <w:t>**CATERINA:** Se chiedessimo oggi a un'AI di sintetizzare l'opinione pubblica su temi complessi, il rischio è ottenere la voce della "maggioranza statistica" presente nei suoi dati di addestramento, silenziando altre prospettive.</w:t>
+      </w:r>
+    </w:p>
+    <w:p/>
+    <w:p>
+      <w:r>
+        <w:t>**SARA:** L'obiettivo della progettazione inclusiva, come ci insegna l'Inclusive Design, è soddisfare il maggior numero possibile di "esigenze reali" degli utenti, non solo la massa. Dobbiamo considerare sia le diversità interne come l'abilità o l'età, sia quelle esterne come il reddito o l'istruzione.</w:t>
+      </w:r>
+    </w:p>
+    <w:p/>
+    <w:p>
+      <w:r>
+        <w:t>**ALBERTO:** Esserne consapevoli ci permette di inserire vincoli precisi nei nostri prompt per ottenere risultati bilanciati e professionali.</w:t>
+      </w:r>
+    </w:p>
+    <w:p/>
+    <w:p>
+      <w:r>
+        <w:rPr>
+          <w:i/>
+          <w:color w:val="555555"/>
+          <w:sz w:val="20"/>
+        </w:rPr>
+        <w:t>**[slide →]**</w:t>
+      </w:r>
+    </w:p>
+    <w:p/>
+    <w:p>
+      <w:r>
+        <w:rPr>
+          <w:color w:val="555555"/>
+          <w:sz w:val="16"/>
+        </w:rPr>
+        <w:t>──────────────────────────────────────────────────────────────────────</w:t>
+      </w:r>
+    </w:p>
+    <w:p/>
     <w:p>
       <w:r>
         <w:rPr>
@@ -1610,12 +1892,35 @@
     <w:p/>
     <w:p>
       <w:pPr>
-        <w:pStyle w:val="Heading3"/>
+        <w:pStyle w:val="Heading1"/>
       </w:pPr>
       <w:r>
         <w:rPr>
-          <w:color w:val="F00A0A"/>
-          <w:sz w:val="24"/>
+          <w:color w:val="06006B"/>
+          <w:sz w:val="40"/>
+        </w:rPr>
+        <w:t>⚡ PARTE 2 — ESERCITAZIONE PRATICA (10 min)</w:t>
+      </w:r>
+    </w:p>
+    <w:p/>
+    <w:p>
+      <w:r>
+        <w:rPr>
+          <w:color w:val="555555"/>
+          <w:sz w:val="16"/>
+        </w:rPr>
+        <w:t>──────────────────────────────────────────────────────────────────────</w:t>
+      </w:r>
+    </w:p>
+    <w:p/>
+    <w:p>
+      <w:pPr>
+        <w:pStyle w:val="Heading2"/>
+      </w:pPr>
+      <w:r>
+        <w:rPr>
+          <w:color w:val="06006B"/>
+          <w:sz w:val="30"/>
         </w:rPr>
         <w:t>SLIDE 22 — ESERCIZIO</w:t>
       </w:r>
@@ -1629,58 +1934,52 @@
           <w:color w:val="0055AA"/>
           <w:sz w:val="20"/>
         </w:rPr>
-        <w:t>[schermo] Step 1: redazione del prompt base | Step 2: applicazione delle Regole d'Oro | Step 3: confronto risultati | ⏱ 7 minuti</w:t>
+        <w:t>[schermo] Tag "⚡ Mani in pasta"</w:t>
+      </w:r>
+    </w:p>
+    <w:p>
+      <w:pPr>
+        <w:ind w:left="432"/>
+      </w:pPr>
+      <w:r>
+        <w:rPr>
+          <w:color w:val="0055AA"/>
+          <w:sz w:val="20"/>
+        </w:rPr>
+        <w:t>Istruzioni: Step 1 — redazione del prompt base | Step 2 — applicazione delle Regole d'Oro | Step 3 — confronto risultati</w:t>
+      </w:r>
+    </w:p>
+    <w:p>
+      <w:pPr>
+        <w:ind w:left="432"/>
+      </w:pPr>
+      <w:r>
+        <w:rPr>
+          <w:color w:val="0055AA"/>
+          <w:sz w:val="20"/>
+        </w:rPr>
+        <w:t>Timer: ⏱ 7 minuti</w:t>
       </w:r>
     </w:p>
     <w:p/>
     <w:p>
       <w:r>
-        <w:rPr>
-          <w:b/>
-          <w:color w:val="F00A0A"/>
-          <w:sz w:val="22"/>
-        </w:rPr>
-        <w:t xml:space="preserve">ALBERTO: </w:t>
-      </w:r>
-      <w:r>
-        <w:rPr>
-          <w:sz w:val="22"/>
-        </w:rPr>
-        <w:t>Ora mettiamo in pratica i concetti. Vi chiediamo di prendere i vostri laptop.</w:t>
+        <w:t>**ALBERTO:** Ora mettiamo in pratica i concetti. Vi chiediamo di prendere i vostri laptop.</w:t>
       </w:r>
     </w:p>
+    <w:p/>
     <w:p>
       <w:r>
-        <w:rPr>
-          <w:b/>
-          <w:color w:val="06006B"/>
-          <w:sz w:val="22"/>
-        </w:rPr>
-        <w:t xml:space="preserve">SARA: </w:t>
-      </w:r>
-      <w:r>
-        <w:rPr>
-          <w:sz w:val="22"/>
-        </w:rPr>
-        <w:t>Scegliete un task reale che dovete affrontare oggi: una mail complessa, una sintesi, una bozza di progetto. Scrivete un primo prompt di getto. Dopodiché, in un'altra finestra, strutturatelo seguendo il framework visto prima (Ruolo, Contesto, Formato).</w:t>
+        <w:t>**SARA:** Scegliete un task reale che dovete affrontare oggi: una mail complessa, una sintesi, una bozza di progetto. Scrivete un primo prompt di getto. Dopodiché, in un'altra finestra, strutturatelo seguendo il framework visto prima (Ruolo, Contesto, Formato).</w:t>
       </w:r>
     </w:p>
+    <w:p/>
     <w:p>
       <w:r>
-        <w:rPr>
-          <w:b/>
-          <w:color w:val="880088"/>
-          <w:sz w:val="22"/>
-        </w:rPr>
-        <w:t xml:space="preserve">CATERINA: </w:t>
-      </w:r>
-      <w:r>
-        <w:rPr>
-          <w:sz w:val="22"/>
-        </w:rPr>
-        <w:t>Abbiamo 7 minuti. Passeremo per un confronto e un supporto in tempo reale.</w:t>
+        <w:t>**CATERINA:** Abbiamo 7 minuti. Passeremo per un confronto e un supporto in tempo reale.</w:t>
       </w:r>
     </w:p>
+    <w:p/>
     <w:p>
       <w:r>
         <w:rPr>
@@ -1688,62 +1987,7 @@
           <w:color w:val="555555"/>
           <w:sz w:val="20"/>
         </w:rPr>
-        <w:t>(i 4 oratori si confrontano con i colleghi ai tavoli)</w:t>
-      </w:r>
-    </w:p>
-    <w:p/>
-    <w:p>
-      <w:pPr>
-        <w:pStyle w:val="Heading3"/>
-      </w:pPr>
-      <w:r>
-        <w:rPr>
-          <w:color w:val="F00A0A"/>
-          <w:sz w:val="24"/>
-        </w:rPr>
-        <w:t>CONDIVISIONE (stessa slide, dopo il timer)</w:t>
-      </w:r>
-    </w:p>
-    <w:p>
-      <w:r>
-        <w:rPr>
-          <w:b/>
-          <w:color w:val="008844"/>
-          <w:sz w:val="22"/>
-        </w:rPr>
-        <w:t xml:space="preserve">GAIA: </w:t>
-      </w:r>
-      <w:r>
-        <w:rPr>
-          <w:sz w:val="22"/>
-        </w:rPr>
-        <w:t>Se qualcuno vuole condividere l'esperienza: avete notato differenze sostanziali tra i due output?</w:t>
-      </w:r>
-    </w:p>
-    <w:p>
-      <w:r>
-        <w:rPr>
-          <w:i/>
-          <w:color w:val="555555"/>
-          <w:sz w:val="20"/>
-        </w:rPr>
-        <w:t>(raccolta volontari — 2-3 esempi, commento e analisi condivisa)</w:t>
-      </w:r>
-    </w:p>
-    <w:p>
-      <w:r>
-        <w:rPr>
-          <w:b/>
-          <w:color w:val="F00A0A"/>
-          <w:sz w:val="22"/>
-        </w:rPr>
-        <w:t xml:space="preserve">ALBERTO: </w:t>
-      </w:r>
-      <w:r>
-        <w:rPr>
-          <w:sz w:val="22"/>
-        </w:rPr>
-        <w:t>Questo è un caso esemplare: aggiungere il contesto del target e il tono di voce desiderato ha evitato la necessità di una revisione estesa.</w:t>
+        <w:t>*(i 4 oratori si confrontano con i colleghi ai tavoli)*</w:t>
       </w:r>
     </w:p>
     <w:p/>
@@ -1756,6 +2000,7 @@
         <w:t>──────────────────────────────────────────────────────────────────────</w:t>
       </w:r>
     </w:p>
+    <w:p/>
     <w:p>
       <w:pPr>
         <w:pStyle w:val="Heading2"/>
@@ -1765,9 +2010,54 @@
           <w:color w:val="06006B"/>
           <w:sz w:val="30"/>
         </w:rPr>
-        <w:t>PARTE 3 — CONFRONTO APERTO E CONCLUSIONI (10 min)</w:t>
+        <w:t>SLIDE 22-bis — CONDIVISIONE (stessa slide, dopo il timer)</w:t>
       </w:r>
     </w:p>
+    <w:p/>
+    <w:p>
+      <w:r>
+        <w:t>**GAIA:** Se qualcuno vuole condividere l'esperienza: avete notato differenze sostanziali tra i due output?</w:t>
+      </w:r>
+    </w:p>
+    <w:p/>
+    <w:p>
+      <w:r>
+        <w:rPr>
+          <w:i/>
+          <w:color w:val="555555"/>
+          <w:sz w:val="20"/>
+        </w:rPr>
+        <w:t>*(raccolta volontari — 2-3 esempi, commento e analisi condivisa)*</w:t>
+      </w:r>
+    </w:p>
+    <w:p/>
+    <w:p>
+      <w:r>
+        <w:t>**ALBERTO:** *(analizzando un esempio)* Questo è un caso esemplare: aggiungere il contesto del target e il tono di voce desiderato ha evitato la necessità di una revisione estesa.</w:t>
+      </w:r>
+    </w:p>
+    <w:p/>
+    <w:p>
+      <w:r>
+        <w:rPr>
+          <w:i/>
+          <w:color w:val="555555"/>
+          <w:sz w:val="20"/>
+        </w:rPr>
+        <w:t>**[slide →]**</w:t>
+      </w:r>
+    </w:p>
+    <w:p/>
+    <w:p>
+      <w:r>
+        <w:rPr>
+          <w:color w:val="555555"/>
+          <w:sz w:val="16"/>
+        </w:rPr>
+        <w:t>──────────────────────────────────────────────────────────────────────</w:t>
+      </w:r>
+    </w:p>
+    <w:p/>
     <w:p>
       <w:r>
         <w:rPr>
@@ -1780,12 +2070,35 @@
     <w:p/>
     <w:p>
       <w:pPr>
-        <w:pStyle w:val="Heading3"/>
+        <w:pStyle w:val="Heading1"/>
       </w:pPr>
       <w:r>
         <w:rPr>
-          <w:color w:val="F00A0A"/>
-          <w:sz w:val="24"/>
+          <w:color w:val="06006B"/>
+          <w:sz w:val="40"/>
+        </w:rPr>
+        <w:t>💬 PARTE 3 — CONFRONTO APERTO E CONCLUSIONI (10 min)</w:t>
+      </w:r>
+    </w:p>
+    <w:p/>
+    <w:p>
+      <w:r>
+        <w:rPr>
+          <w:color w:val="555555"/>
+          <w:sz w:val="16"/>
+        </w:rPr>
+        <w:t>──────────────────────────────────────────────────────────────────────</w:t>
+      </w:r>
+    </w:p>
+    <w:p/>
+    <w:p>
+      <w:pPr>
+        <w:pStyle w:val="Heading2"/>
+      </w:pPr>
+      <w:r>
+        <w:rPr>
+          <w:color w:val="06006B"/>
+          <w:sz w:val="30"/>
         </w:rPr>
         <w:t>SLIDE 23 — Q&amp;A APERTO + LINK APPROFONDIMENTI</w:t>
       </w:r>
@@ -1799,26 +2112,28 @@
           <w:color w:val="0055AA"/>
           <w:sz w:val="20"/>
         </w:rPr>
-        <w:t>[schermo] "Riflessioni e Confronto" + 3 domande callout + colonna link: Tokenizer / Caveman / SciTechDaily / The Bunker / Medium</w:t>
+        <w:t>[schermo] "Riflessioni e Confronto" + 3 callout domande</w:t>
+      </w:r>
+    </w:p>
+    <w:p>
+      <w:pPr>
+        <w:ind w:left="432"/>
+      </w:pPr>
+      <w:r>
+        <w:rPr>
+          <w:color w:val="0055AA"/>
+          <w:sz w:val="20"/>
+        </w:rPr>
+        <w:t>Colonna destra: link approfondimenti (Tokenizer, Caveman, SciTechDaily, The Bunker, Medium Markdown)</w:t>
       </w:r>
     </w:p>
     <w:p/>
     <w:p>
       <w:r>
-        <w:rPr>
-          <w:b/>
-          <w:color w:val="880088"/>
-          <w:sz w:val="22"/>
-        </w:rPr>
-        <w:t xml:space="preserve">CATERINA: </w:t>
-      </w:r>
-      <w:r>
-        <w:rPr>
-          <w:sz w:val="22"/>
-        </w:rPr>
-        <w:t>Invece del classico Q&amp;A, vi chiediamo: quale aspetto trattato oggi pensate di applicare da subito o vi ha fatto riflettere di più?</w:t>
+        <w:t>**CATERINA:** Invece del classico Q&amp;A, vi chiediamo: quale aspetto trattato oggi pensate di applicare da subito o vi ha fatto riflettere di più?</w:t>
       </w:r>
     </w:p>
+    <w:p/>
     <w:p>
       <w:r>
         <w:rPr>
@@ -1826,450 +2141,30 @@
           <w:color w:val="555555"/>
           <w:sz w:val="20"/>
         </w:rPr>
-        <w:t>(gestione del confronto, risposta a domande operative)</w:t>
-      </w:r>
-    </w:p>
-    <w:p>
-      <w:r>
-        <w:rPr>
-          <w:b/>
-          <w:color w:val="06006B"/>
-          <w:sz w:val="22"/>
-        </w:rPr>
-        <w:t xml:space="preserve">SARA: </w:t>
-      </w:r>
-      <w:r>
-        <w:rPr>
-          <w:sz w:val="22"/>
-        </w:rPr>
-        <w:t>Ringraziandovi per la partecipazione, vi anticipiamo che nella prossima sessione affronteremo il tema degli Agenti AI e dell'automazione di workflow strutturati.</w:t>
-      </w:r>
-    </w:p>
-    <w:p>
-      <w:r>
-        <w:rPr>
-          <w:b/>
-          <w:color w:val="F00A0A"/>
-          <w:sz w:val="22"/>
-        </w:rPr>
-        <w:t xml:space="preserve">ALBERTO: </w:t>
-      </w:r>
-      <w:r>
-        <w:rPr>
-          <w:sz w:val="22"/>
-        </w:rPr>
-        <w:t>Sullo schermo trovate alcuni link di approfondimento per continuare l'esplorazione.</w:t>
-      </w:r>
-    </w:p>
-    <w:p/>
-    <w:p>
-      <w:pPr>
-        <w:pStyle w:val="Heading3"/>
-      </w:pPr>
-      <w:r>
-        <w:rPr>
-          <w:color w:val="F00A0A"/>
-          <w:sz w:val="24"/>
-        </w:rPr>
-        <w:t>SLIDE 24 — GRAZIE</w:t>
-      </w:r>
-    </w:p>
-    <w:p>
-      <w:r>
-        <w:rPr>
-          <w:b/>
-          <w:color w:val="000000"/>
-          <w:sz w:val="22"/>
-        </w:rPr>
-        <w:t xml:space="preserve">TUTTI: </w:t>
-      </w:r>
-      <w:r>
-        <w:rPr>
-          <w:sz w:val="22"/>
-        </w:rPr>
-        <w:t>Grazie mille a tutti!</w:t>
-      </w:r>
-    </w:p>
-    <w:p>
-      <w:r>
-        <w:rPr>
-          <w:b/>
-          <w:color w:val="880088"/>
-          <w:sz w:val="22"/>
-        </w:rPr>
-        <w:t xml:space="preserve">CATERINA: </w:t>
-      </w:r>
-      <w:r>
-        <w:rPr>
-          <w:sz w:val="22"/>
-        </w:rPr>
-        <w:t>Il nostro suggerimento finale è di non temere gli output imperfetti: ogni iterazione è un'opportunità per capire meglio come interagire con l'intelligenza artificiale. A presto.</w:t>
+        <w:t>*(gestione del confronto, risposta a domande operative)*</w:t>
       </w:r>
     </w:p>
     <w:p/>
     <w:p>
       <w:r>
-        <w:br w:type="page"/>
-      </w:r>
-    </w:p>
-    <w:p>
-      <w:pPr>
-        <w:pStyle w:val="Heading1"/>
-      </w:pPr>
-      <w:r>
-        <w:rPr>
-          <w:color w:val="06006B"/>
-          <w:sz w:val="40"/>
-        </w:rPr>
-        <w:t>BIBLIOGRAFIA &amp; FONTI</w:t>
-      </w:r>
-    </w:p>
-    <w:p>
-      <w:r>
-        <w:rPr>
-          <w:b/>
-          <w:i w:val="0"/>
-          <w:color w:val="06006B"/>
-          <w:sz w:val="26"/>
-        </w:rPr>
-        <w:t>Workshop AI Interno — Sessione 1</w:t>
+        <w:t>**SARA:** Ringraziandovi per la partecipazione, vi anticipiamo che nella prossima sessione affronteremo il tema degli Agenti AI e dell'automazione di workflow strutturati.</w:t>
       </w:r>
     </w:p>
     <w:p/>
     <w:p>
-      <w:pPr>
-        <w:pStyle w:val="Heading3"/>
-      </w:pPr>
       <w:r>
-        <w:rPr>
-          <w:color w:val="F00A0A"/>
-          <w:sz w:val="24"/>
-        </w:rPr>
-        <w:t>1. Consumo energetico AI</w:t>
-      </w:r>
-    </w:p>
-    <w:p>
-      <w:r>
-        <w:rPr>
-          <w:b w:val="0"/>
-          <w:i w:val="0"/>
-          <w:color w:val="000000"/>
-          <w:sz w:val="22"/>
-        </w:rPr>
-        <w:t>SciTechDaily — "Study Debunks Major Myth: AI's Energy Usage Is Significantly Less Than Feared"</w:t>
-      </w:r>
-    </w:p>
-    <w:p>
-      <w:r>
-        <w:rPr>
-          <w:b w:val="0"/>
-          <w:i w:val="0"/>
-          <w:color w:val="0055AA"/>
-          <w:sz w:val="20"/>
-        </w:rPr>
-        <w:t>https://scitechdaily.com/study-debunks-major-myth-ais-energy-usage-is-significantly-less-than-feared/</w:t>
+        <w:t>**ALBERTO:** Sullo schermo trovate alcuni link di approfondimento per continuare l'esplorazione.</w:t>
       </w:r>
     </w:p>
     <w:p/>
     <w:p>
       <w:r>
         <w:rPr>
-          <w:b w:val="0"/>
-          <w:i w:val="0"/>
-          <w:color w:val="000000"/>
-          <w:sz w:val="22"/>
-        </w:rPr>
-        <w:t>The Bunker — "Does AI Pollute and How Does It Compare to Other Everyday Activities?"</w:t>
-      </w:r>
-    </w:p>
-    <w:p>
-      <w:r>
-        <w:rPr>
-          <w:b w:val="0"/>
-          <w:i w:val="0"/>
-          <w:color w:val="0055AA"/>
-          <w:sz w:val="20"/>
-        </w:rPr>
-        <w:t>https://www.the-bunker.it/en/rubrica/does-ai-pollute-and-how-does-it-compare-to-other-everyday-activities/</w:t>
-      </w:r>
-    </w:p>
-    <w:p/>
-    <w:p>
-      <w:pPr>
-        <w:pStyle w:val="Heading3"/>
-      </w:pPr>
-      <w:r>
-        <w:rPr>
-          <w:color w:val="F00A0A"/>
-          <w:sz w:val="24"/>
-        </w:rPr>
-        <w:t>2. Gestione file e formati</w:t>
-      </w:r>
-    </w:p>
-    <w:p>
-      <w:r>
-        <w:rPr>
-          <w:b w:val="0"/>
-          <w:i w:val="0"/>
-          <w:color w:val="000000"/>
-          <w:sz w:val="22"/>
-        </w:rPr>
-        <w:t>Medium — Lawrence Teixeira: "From Locked PDFs to Limitless AI: The Plain-Text Revolution You Can't Ignore"</w:t>
-      </w:r>
-    </w:p>
-    <w:p>
-      <w:r>
-        <w:rPr>
-          <w:b w:val="0"/>
-          <w:i w:val="0"/>
-          <w:color w:val="0055AA"/>
-          <w:sz w:val="20"/>
-        </w:rPr>
-        <w:t>https://medium.com/@lawrenceteixeira/from-locked-pdfs-to-limitless-ai-the-plain-text-revolution-you-cant-ignore-b1592aae3cb4</w:t>
-      </w:r>
-    </w:p>
-    <w:p/>
-    <w:p>
-      <w:r>
-        <w:rPr>
-          <w:b w:val="0"/>
-          <w:i w:val="0"/>
-          <w:color w:val="000000"/>
-          <w:sz w:val="22"/>
-        </w:rPr>
-        <w:t>Medium — Cristian Lefter: "Why Markdown Became the Working Language of AI"</w:t>
-      </w:r>
-    </w:p>
-    <w:p>
-      <w:r>
-        <w:rPr>
-          <w:b w:val="0"/>
-          <w:i w:val="0"/>
-          <w:color w:val="0055AA"/>
-          <w:sz w:val="20"/>
-        </w:rPr>
-        <w:t>https://medium.com/@cristian.lefter/why-markdown-became-the-working-language-of-ai-44a5f19a423c</w:t>
-      </w:r>
-    </w:p>
-    <w:p/>
-    <w:p>
-      <w:pPr>
-        <w:pStyle w:val="Heading3"/>
-      </w:pPr>
-      <w:r>
-        <w:rPr>
-          <w:color w:val="F00A0A"/>
-          <w:sz w:val="24"/>
-        </w:rPr>
-        <w:t>3. Prompt Engineering</w:t>
-      </w:r>
-    </w:p>
-    <w:p>
-      <w:r>
-        <w:rPr>
-          <w:b w:val="0"/>
-          <w:i w:val="0"/>
-          <w:color w:val="000000"/>
-          <w:sz w:val="22"/>
-        </w:rPr>
-        <w:t>OpenAI Tokenizer — strumento per visualizzare come i modelli spezzano il testo in token</w:t>
-      </w:r>
-    </w:p>
-    <w:p>
-      <w:r>
-        <w:rPr>
-          <w:b w:val="0"/>
-          <w:i w:val="0"/>
-          <w:color w:val="0055AA"/>
-          <w:sz w:val="20"/>
-        </w:rPr>
-        <w:t>https://platform.openai.com/tokenizer</w:t>
-      </w:r>
-    </w:p>
-    <w:p/>
-    <w:p>
-      <w:r>
-        <w:rPr>
-          <w:b/>
-          <w:i w:val="0"/>
-          <w:color w:val="000000"/>
-          <w:sz w:val="22"/>
-        </w:rPr>
-        <w:t>PDF interno — slide_ai_prompt_design.pdf</w:t>
-      </w:r>
-    </w:p>
-    <w:p>
-      <w:r>
-        <w:rPr>
-          <w:b w:val="0"/>
-          <w:i w:val="0"/>
+          <w:i/>
           <w:color w:val="555555"/>
           <w:sz w:val="20"/>
         </w:rPr>
-        <w:t>Pagine usate: p.5 (ecosistema), p.6-7-8 (arricchimento), p.12 (regole base), p.15-16 (tecniche), p.18 (prima/dopo), p.20-21-22 (strutture avanzate), p.23-24-25 (inclusività → prompt)</w:t>
-      </w:r>
-    </w:p>
-    <w:p/>
-    <w:p>
-      <w:pPr>
-        <w:pStyle w:val="Heading3"/>
-      </w:pPr>
-      <w:r>
-        <w:rPr>
-          <w:color w:val="F00A0A"/>
-          <w:sz w:val="24"/>
-        </w:rPr>
-        <w:t>4. Inclusività &amp; Etica AI</w:t>
-      </w:r>
-    </w:p>
-    <w:p>
-      <w:r>
-        <w:rPr>
-          <w:b/>
-          <w:i w:val="0"/>
-          <w:color w:val="000000"/>
-          <w:sz w:val="22"/>
-        </w:rPr>
-        <w:t>PDF interno — slide_ai_inclusivity.pdf</w:t>
-      </w:r>
-    </w:p>
-    <w:p>
-      <w:r>
-        <w:rPr>
-          <w:b w:val="0"/>
-          <w:i w:val="0"/>
-          <w:color w:val="555555"/>
-          <w:sz w:val="20"/>
-        </w:rPr>
-        <w:t>Pagine usate: p.9 (schema bias), p.11-12-14 (riflessione post-video). Approfondimento: p.22-40 (solo link).</w:t>
-      </w:r>
-    </w:p>
-    <w:p/>
-    <w:p>
-      <w:r>
-        <w:rPr>
-          <w:b/>
-          <w:i w:val="0"/>
-          <w:color w:val="000000"/>
-          <w:sz w:val="22"/>
-        </w:rPr>
-        <w:t>PDF interno — dove_inclusive_prompt_images.pdf</w:t>
-      </w:r>
-    </w:p>
-    <w:p>
-      <w:r>
-        <w:rPr>
-          <w:b w:val="0"/>
-          <w:i w:val="0"/>
-          <w:color w:val="555555"/>
-          <w:sz w:val="20"/>
-        </w:rPr>
-        <w:t>Immagini e case study di bias visivo nei risultati di generazione AI.</w:t>
-      </w:r>
-    </w:p>
-    <w:p/>
-    <w:p>
-      <w:pPr>
-        <w:pStyle w:val="Heading3"/>
-      </w:pPr>
-      <w:r>
-        <w:rPr>
-          <w:color w:val="F00A0A"/>
-          <w:sz w:val="24"/>
-        </w:rPr>
-        <w:t>5. Video</w:t>
-      </w:r>
-    </w:p>
-    <w:p>
-      <w:r>
-        <w:rPr>
-          <w:b w:val="0"/>
-          <w:i w:val="0"/>
-          <w:color w:val="000000"/>
-          <w:sz w:val="22"/>
-        </w:rPr>
-        <w:t>Pier Paolo Pasolini — Comizi d'Amore (1964) — Clip con Ungaretti</w:t>
-      </w:r>
-    </w:p>
-    <w:p>
-      <w:r>
-        <w:rPr>
-          <w:b w:val="0"/>
-          <w:i w:val="0"/>
-          <w:color w:val="0055AA"/>
-          <w:sz w:val="20"/>
-        </w:rPr>
-        <w:t>https://www.youtube.com/watch?v=A5-kvHUcJw8  |  Durata clip: ~2 min</w:t>
-      </w:r>
-    </w:p>
-    <w:p/>
-    <w:p>
-      <w:pPr>
-        <w:pStyle w:val="Heading3"/>
-      </w:pPr>
-      <w:r>
-        <w:rPr>
-          <w:color w:val="F00A0A"/>
-          <w:sz w:val="24"/>
-        </w:rPr>
-        <w:t>6. Tool citati</w:t>
-      </w:r>
-    </w:p>
-    <w:p>
-      <w:r>
-        <w:rPr>
-          <w:b w:val="0"/>
-          <w:i w:val="0"/>
-          <w:color w:val="000000"/>
-          <w:sz w:val="22"/>
-        </w:rPr>
-        <w:t>Caveman — compressore di output AI, open source (risparmio 30-65% token)</w:t>
-      </w:r>
-    </w:p>
-    <w:p>
-      <w:r>
-        <w:rPr>
-          <w:b w:val="0"/>
-          <w:i w:val="0"/>
-          <w:color w:val="0055AA"/>
-          <w:sz w:val="20"/>
-        </w:rPr>
-        <w:t>https://github.com/JuliusBrussee/caveman</w:t>
-      </w:r>
-    </w:p>
-    <w:p/>
-    <w:p>
-      <w:pPr>
-        <w:pStyle w:val="Heading3"/>
-      </w:pPr>
-      <w:r>
-        <w:rPr>
-          <w:color w:val="F00A0A"/>
-          <w:sz w:val="24"/>
-        </w:rPr>
-        <w:t>7. Corso di riferimento</w:t>
-      </w:r>
-    </w:p>
-    <w:p>
-      <w:r>
-        <w:rPr>
-          <w:b w:val="0"/>
-          <w:i w:val="0"/>
-          <w:color w:val="000000"/>
-          <w:sz w:val="22"/>
-        </w:rPr>
-        <w:t>Skool AI Academy — materiale di approfondimento per approfondire i temi trattati</w:t>
-      </w:r>
-    </w:p>
-    <w:p>
-      <w:r>
-        <w:rPr>
-          <w:b w:val="0"/>
-          <w:i w:val="0"/>
-          <w:color w:val="0055AA"/>
-          <w:sz w:val="20"/>
-        </w:rPr>
-        <w:t>https://www.skool.com/ai-academy-2306/classroom/a6764c58?md=49fd716208a74c8084e37708a01e5f14</w:t>
+        <w:t>**[slide →]**</w:t>
       </w:r>
     </w:p>
     <w:p/>
@@ -2282,15 +2177,202 @@
         <w:t>──────────────────────────────────────────────────────────────────────</w:t>
       </w:r>
     </w:p>
+    <w:p/>
+    <w:p>
+      <w:pPr>
+        <w:pStyle w:val="Heading2"/>
+      </w:pPr>
+      <w:r>
+        <w:rPr>
+          <w:color w:val="06006B"/>
+          <w:sz w:val="30"/>
+        </w:rPr>
+        <w:t>SLIDE 24 — GRAZIE</w:t>
+      </w:r>
+    </w:p>
+    <w:p>
+      <w:pPr>
+        <w:ind w:left="432"/>
+      </w:pPr>
+      <w:r>
+        <w:rPr>
+          <w:color w:val="0055AA"/>
+          <w:sz w:val="20"/>
+        </w:rPr>
+        <w:t>[schermo] "Grazie!" | "L'innovazione richiede pratica continua."</w:t>
+      </w:r>
+    </w:p>
+    <w:p>
+      <w:pPr>
+        <w:ind w:left="432"/>
+      </w:pPr>
+      <w:r>
+        <w:rPr>
+          <w:color w:val="0055AA"/>
+          <w:sz w:val="20"/>
+        </w:rPr>
+        <w:t>Nomi: Sara · Alberto · Gaia · Caterina | "Sessione 2 in arrivo — Agenti AI &amp; Automazioni"</w:t>
+      </w:r>
+    </w:p>
+    <w:p/>
+    <w:p>
+      <w:r>
+        <w:t>**TUTTI:** Grazie mille a tutti!</w:t>
+      </w:r>
+    </w:p>
+    <w:p/>
+    <w:p>
+      <w:r>
+        <w:t>**CATERINA:** Il nostro suggerimento finale è di non temere gli output imperfetti: ogni iterazione è un'opportunità per capire meglio come interagire con l'intelligenza artificiale. A presto.</w:t>
+      </w:r>
+    </w:p>
+    <w:p/>
     <w:p>
       <w:r>
         <w:rPr>
-          <w:b w:val="0"/>
-          <w:i/>
           <w:color w:val="555555"/>
-          <w:sz w:val="18"/>
+          <w:sz w:val="16"/>
         </w:rPr>
-        <w:t>Nota: i link ai PDF interni non sono pubblici. Richiedere accesso alla cartella condivisa del progetto.</w:t>
+        <w:t>──────────────────────────────────────────────────────────────────────</w:t>
+      </w:r>
+    </w:p>
+    <w:p/>
+    <w:p>
+      <w:r>
+        <w:rPr>
+          <w:color w:val="555555"/>
+          <w:sz w:val="16"/>
+        </w:rPr>
+        <w:t>──────────────────────────────────────────────────────────────────────</w:t>
+      </w:r>
+    </w:p>
+    <w:p/>
+    <w:p>
+      <w:pPr>
+        <w:pStyle w:val="Heading1"/>
+      </w:pPr>
+      <w:r>
+        <w:rPr>
+          <w:color w:val="06006B"/>
+          <w:sz w:val="40"/>
+        </w:rPr>
+        <w:t>📚 NOTE DI PRODUZIONE</w:t>
+      </w:r>
+    </w:p>
+    <w:p/>
+    <w:p>
+      <w:pPr>
+        <w:pStyle w:val="Heading2"/>
+      </w:pPr>
+      <w:r>
+        <w:rPr>
+          <w:color w:val="06006B"/>
+          <w:sz w:val="30"/>
+        </w:rPr>
+        <w:t>Placeholder da completare (dopo lettura PDF)</w:t>
+      </w:r>
+    </w:p>
+    <w:p>
+      <w:r>
+        <w:t>| Slide | Fonte | Contenuto |</w:t>
+      </w:r>
+    </w:p>
+    <w:p>
+      <w:r>
+        <w:t>|---|---|---|</w:t>
+      </w:r>
+    </w:p>
+    <w:p>
+      <w:r>
+        <w:t>| 14 | slide_ai_prompt_design p.12 + p.15-16 | Regole d'oro aggiuntive |</w:t>
+      </w:r>
+    </w:p>
+    <w:p>
+      <w:r>
+        <w:t>| 15 | slide_ai_prompt_design p.18 | Esempio pratico prima/dopo |</w:t>
+      </w:r>
+    </w:p>
+    <w:p>
+      <w:r>
+        <w:t>| 16 | slide_ai_prompt_design p.20-21-22 | Strutture avanzate |</w:t>
+      </w:r>
+    </w:p>
+    <w:p>
+      <w:r>
+        <w:t>| 19 | slide_ai_prompt_design p.23-24-25 + slide_ai_inclusivity p.9 | Bias e schema |</w:t>
+      </w:r>
+    </w:p>
+    <w:p>
+      <w:r>
+        <w:t>| 21 | slide_ai_inclusivity p.11-12-14 | Post-video riflessione |</w:t>
+      </w:r>
+    </w:p>
+    <w:p/>
+    <w:p>
+      <w:pPr>
+        <w:pStyle w:val="Heading2"/>
+      </w:pPr>
+      <w:r>
+        <w:rPr>
+          <w:color w:val="06006B"/>
+          <w:sz w:val="30"/>
+        </w:rPr>
+        <w:t>Distribuzione oratori</w:t>
+      </w:r>
+    </w:p>
+    <w:p>
+      <w:r>
+        <w:t>| Oratore | Blocchi principali |</w:t>
+      </w:r>
+    </w:p>
+    <w:p>
+      <w:r>
+        <w:t>|---|---|</w:t>
+      </w:r>
+    </w:p>
+    <w:p>
+      <w:r>
+        <w:t>| Sara | Ecosistema (player), Prompt rules, Post-video |</w:t>
+      </w:r>
+    </w:p>
+    <w:p>
+      <w:r>
+        <w:t>| Alberto | Come funziona AI, Quiz, Esercizio, Chiusura |</w:t>
+      </w:r>
+    </w:p>
+    <w:p>
+      <w:r>
+        <w:t>| Gaia | Consumi, Come funziona AI, Bias/Inclusività, Link |</w:t>
+      </w:r>
+    </w:p>
+    <w:p>
+      <w:r>
+        <w:t>| Caterina | File, Caveman, Bias intro, Chiusura |</w:t>
+      </w:r>
+    </w:p>
+    <w:p/>
+    <w:p>
+      <w:pPr>
+        <w:pStyle w:val="Heading2"/>
+      </w:pPr>
+      <w:r>
+        <w:rPr>
+          <w:color w:val="06006B"/>
+          <w:sz w:val="30"/>
+        </w:rPr>
+        <w:t>Slide count: 24 (+ 1 momento condivisione su slide 22)</w:t>
+      </w:r>
+    </w:p>
+    <w:p>
+      <w:pPr>
+        <w:pStyle w:val="Heading2"/>
+      </w:pPr>
+      <w:r>
+        <w:rPr>
+          <w:color w:val="06006B"/>
+          <w:sz w:val="30"/>
+        </w:rPr>
+        <w:t>Quiz: 2 (slide 8 — consumi / slide 11 — file .md)</w:t>
       </w:r>
     </w:p>
     <w:sectPr>

</xml_diff>